<commit_message>
Bedienungsanleitung als Word-Fassung neu erzeugt
Co-authored-by: Cursor <cursoragent@cursor.com>
</commit_message>
<xml_diff>
--- a/doku/Bedienungsanleitung.docx
+++ b/doku/Bedienungsanleitung.docx
@@ -134,7 +134,7 @@
         <w:rPr>
           <w:noProof/>
         </w:rPr>
-        <w:instrText xml:space="preserve"> PAGEREF _Toc240888885 \h </w:instrText>
+        <w:instrText xml:space="preserve"> PAGEREF _Toc240904486 \h </w:instrText>
       </w:r>
       <w:r>
         <w:rPr>
@@ -151,7 +151,7 @@
         <w:rPr>
           <w:noProof/>
         </w:rPr>
-        <w:t>5</w:t>
+        <w:t>6</w:t>
       </w:r>
       <w:r>
         <w:rPr>
@@ -194,7 +194,7 @@
         <w:rPr>
           <w:noProof/>
         </w:rPr>
-        <w:instrText xml:space="preserve"> PAGEREF _Toc240888886 \h </w:instrText>
+        <w:instrText xml:space="preserve"> PAGEREF _Toc240904487 \h </w:instrText>
       </w:r>
       <w:r>
         <w:rPr>
@@ -211,7 +211,7 @@
         <w:rPr>
           <w:noProof/>
         </w:rPr>
-        <w:t>5</w:t>
+        <w:t>6</w:t>
       </w:r>
       <w:r>
         <w:rPr>
@@ -254,7 +254,7 @@
         <w:rPr>
           <w:noProof/>
         </w:rPr>
-        <w:instrText xml:space="preserve"> PAGEREF _Toc240888887 \h </w:instrText>
+        <w:instrText xml:space="preserve"> PAGEREF _Toc240904488 \h </w:instrText>
       </w:r>
       <w:r>
         <w:rPr>
@@ -271,7 +271,7 @@
         <w:rPr>
           <w:noProof/>
         </w:rPr>
-        <w:t>5</w:t>
+        <w:t>6</w:t>
       </w:r>
       <w:r>
         <w:rPr>
@@ -314,7 +314,7 @@
         <w:rPr>
           <w:noProof/>
         </w:rPr>
-        <w:instrText xml:space="preserve"> PAGEREF _Toc240888888 \h </w:instrText>
+        <w:instrText xml:space="preserve"> PAGEREF _Toc240904489 \h </w:instrText>
       </w:r>
       <w:r>
         <w:rPr>
@@ -331,7 +331,7 @@
         <w:rPr>
           <w:noProof/>
         </w:rPr>
-        <w:t>5</w:t>
+        <w:t>6</w:t>
       </w:r>
       <w:r>
         <w:rPr>
@@ -374,7 +374,7 @@
         <w:rPr>
           <w:noProof/>
         </w:rPr>
-        <w:instrText xml:space="preserve"> PAGEREF _Toc240888889 \h </w:instrText>
+        <w:instrText xml:space="preserve"> PAGEREF _Toc240904490 \h </w:instrText>
       </w:r>
       <w:r>
         <w:rPr>
@@ -391,7 +391,7 @@
         <w:rPr>
           <w:noProof/>
         </w:rPr>
-        <w:t>6</w:t>
+        <w:t>7</w:t>
       </w:r>
       <w:r>
         <w:rPr>
@@ -434,7 +434,7 @@
         <w:rPr>
           <w:noProof/>
         </w:rPr>
-        <w:instrText xml:space="preserve"> PAGEREF _Toc240888890 \h </w:instrText>
+        <w:instrText xml:space="preserve"> PAGEREF _Toc240904491 \h </w:instrText>
       </w:r>
       <w:r>
         <w:rPr>
@@ -451,7 +451,7 @@
         <w:rPr>
           <w:noProof/>
         </w:rPr>
-        <w:t>6</w:t>
+        <w:t>7</w:t>
       </w:r>
       <w:r>
         <w:rPr>
@@ -494,7 +494,7 @@
         <w:rPr>
           <w:noProof/>
         </w:rPr>
-        <w:instrText xml:space="preserve"> PAGEREF _Toc240888891 \h </w:instrText>
+        <w:instrText xml:space="preserve"> PAGEREF _Toc240904492 \h </w:instrText>
       </w:r>
       <w:r>
         <w:rPr>
@@ -511,7 +511,7 @@
         <w:rPr>
           <w:noProof/>
         </w:rPr>
-        <w:t>6</w:t>
+        <w:t>7</w:t>
       </w:r>
       <w:r>
         <w:rPr>
@@ -554,7 +554,7 @@
         <w:rPr>
           <w:noProof/>
         </w:rPr>
-        <w:instrText xml:space="preserve"> PAGEREF _Toc240888892 \h </w:instrText>
+        <w:instrText xml:space="preserve"> PAGEREF _Toc240904493 \h </w:instrText>
       </w:r>
       <w:r>
         <w:rPr>
@@ -571,7 +571,7 @@
         <w:rPr>
           <w:noProof/>
         </w:rPr>
-        <w:t>6</w:t>
+        <w:t>7</w:t>
       </w:r>
       <w:r>
         <w:rPr>
@@ -614,7 +614,7 @@
         <w:rPr>
           <w:noProof/>
         </w:rPr>
-        <w:instrText xml:space="preserve"> PAGEREF _Toc240888893 \h </w:instrText>
+        <w:instrText xml:space="preserve"> PAGEREF _Toc240904494 \h </w:instrText>
       </w:r>
       <w:r>
         <w:rPr>
@@ -631,7 +631,7 @@
         <w:rPr>
           <w:noProof/>
         </w:rPr>
-        <w:t>8</w:t>
+        <w:t>9</w:t>
       </w:r>
       <w:r>
         <w:rPr>
@@ -674,7 +674,7 @@
         <w:rPr>
           <w:noProof/>
         </w:rPr>
-        <w:instrText xml:space="preserve"> PAGEREF _Toc240888894 \h </w:instrText>
+        <w:instrText xml:space="preserve"> PAGEREF _Toc240904495 \h </w:instrText>
       </w:r>
       <w:r>
         <w:rPr>
@@ -691,7 +691,7 @@
         <w:rPr>
           <w:noProof/>
         </w:rPr>
-        <w:t>8</w:t>
+        <w:t>9</w:t>
       </w:r>
       <w:r>
         <w:rPr>
@@ -734,7 +734,7 @@
         <w:rPr>
           <w:noProof/>
         </w:rPr>
-        <w:instrText xml:space="preserve"> PAGEREF _Toc240888895 \h </w:instrText>
+        <w:instrText xml:space="preserve"> PAGEREF _Toc240904496 \h </w:instrText>
       </w:r>
       <w:r>
         <w:rPr>
@@ -751,7 +751,7 @@
         <w:rPr>
           <w:noProof/>
         </w:rPr>
-        <w:t>8</w:t>
+        <w:t>9</w:t>
       </w:r>
       <w:r>
         <w:rPr>
@@ -794,7 +794,7 @@
         <w:rPr>
           <w:noProof/>
         </w:rPr>
-        <w:instrText xml:space="preserve"> PAGEREF _Toc240888896 \h </w:instrText>
+        <w:instrText xml:space="preserve"> PAGEREF _Toc240904497 \h </w:instrText>
       </w:r>
       <w:r>
         <w:rPr>
@@ -811,7 +811,7 @@
         <w:rPr>
           <w:noProof/>
         </w:rPr>
-        <w:t>9</w:t>
+        <w:t>10</w:t>
       </w:r>
       <w:r>
         <w:rPr>
@@ -854,7 +854,7 @@
         <w:rPr>
           <w:noProof/>
         </w:rPr>
-        <w:instrText xml:space="preserve"> PAGEREF _Toc240888897 \h </w:instrText>
+        <w:instrText xml:space="preserve"> PAGEREF _Toc240904498 \h </w:instrText>
       </w:r>
       <w:r>
         <w:rPr>
@@ -871,7 +871,7 @@
         <w:rPr>
           <w:noProof/>
         </w:rPr>
-        <w:t>10</w:t>
+        <w:t>11</w:t>
       </w:r>
       <w:r>
         <w:rPr>
@@ -914,7 +914,7 @@
         <w:rPr>
           <w:noProof/>
         </w:rPr>
-        <w:instrText xml:space="preserve"> PAGEREF _Toc240888898 \h </w:instrText>
+        <w:instrText xml:space="preserve"> PAGEREF _Toc240904499 \h </w:instrText>
       </w:r>
       <w:r>
         <w:rPr>
@@ -931,7 +931,7 @@
         <w:rPr>
           <w:noProof/>
         </w:rPr>
-        <w:t>10</w:t>
+        <w:t>11</w:t>
       </w:r>
       <w:r>
         <w:rPr>
@@ -974,7 +974,7 @@
         <w:rPr>
           <w:noProof/>
         </w:rPr>
-        <w:instrText xml:space="preserve"> PAGEREF _Toc240888899 \h </w:instrText>
+        <w:instrText xml:space="preserve"> PAGEREF _Toc240904500 \h </w:instrText>
       </w:r>
       <w:r>
         <w:rPr>
@@ -991,7 +991,7 @@
         <w:rPr>
           <w:noProof/>
         </w:rPr>
-        <w:t>11</w:t>
+        <w:t>12</w:t>
       </w:r>
       <w:r>
         <w:rPr>
@@ -1034,7 +1034,7 @@
         <w:rPr>
           <w:noProof/>
         </w:rPr>
-        <w:instrText xml:space="preserve"> PAGEREF _Toc240888900 \h </w:instrText>
+        <w:instrText xml:space="preserve"> PAGEREF _Toc240904501 \h </w:instrText>
       </w:r>
       <w:r>
         <w:rPr>
@@ -1051,7 +1051,7 @@
         <w:rPr>
           <w:noProof/>
         </w:rPr>
-        <w:t>11</w:t>
+        <w:t>12</w:t>
       </w:r>
       <w:r>
         <w:rPr>
@@ -1094,7 +1094,7 @@
         <w:rPr>
           <w:noProof/>
         </w:rPr>
-        <w:instrText xml:space="preserve"> PAGEREF _Toc240888901 \h </w:instrText>
+        <w:instrText xml:space="preserve"> PAGEREF _Toc240904502 \h </w:instrText>
       </w:r>
       <w:r>
         <w:rPr>
@@ -1111,7 +1111,7 @@
         <w:rPr>
           <w:noProof/>
         </w:rPr>
-        <w:t>11</w:t>
+        <w:t>12</w:t>
       </w:r>
       <w:r>
         <w:rPr>
@@ -1154,7 +1154,7 @@
         <w:rPr>
           <w:noProof/>
         </w:rPr>
-        <w:instrText xml:space="preserve"> PAGEREF _Toc240888902 \h </w:instrText>
+        <w:instrText xml:space="preserve"> PAGEREF _Toc240904503 \h </w:instrText>
       </w:r>
       <w:r>
         <w:rPr>
@@ -1171,7 +1171,7 @@
         <w:rPr>
           <w:noProof/>
         </w:rPr>
-        <w:t>12</w:t>
+        <w:t>13</w:t>
       </w:r>
       <w:r>
         <w:rPr>
@@ -1214,7 +1214,7 @@
         <w:rPr>
           <w:noProof/>
         </w:rPr>
-        <w:instrText xml:space="preserve"> PAGEREF _Toc240888903 \h </w:instrText>
+        <w:instrText xml:space="preserve"> PAGEREF _Toc240904504 \h </w:instrText>
       </w:r>
       <w:r>
         <w:rPr>
@@ -1231,7 +1231,7 @@
         <w:rPr>
           <w:noProof/>
         </w:rPr>
-        <w:t>12</w:t>
+        <w:t>13</w:t>
       </w:r>
       <w:r>
         <w:rPr>
@@ -1274,7 +1274,7 @@
         <w:rPr>
           <w:noProof/>
         </w:rPr>
-        <w:instrText xml:space="preserve"> PAGEREF _Toc240888904 \h </w:instrText>
+        <w:instrText xml:space="preserve"> PAGEREF _Toc240904505 \h </w:instrText>
       </w:r>
       <w:r>
         <w:rPr>
@@ -1291,7 +1291,7 @@
         <w:rPr>
           <w:noProof/>
         </w:rPr>
-        <w:t>13</w:t>
+        <w:t>14</w:t>
       </w:r>
       <w:r>
         <w:rPr>
@@ -1334,7 +1334,7 @@
         <w:rPr>
           <w:noProof/>
         </w:rPr>
-        <w:instrText xml:space="preserve"> PAGEREF _Toc240888905 \h </w:instrText>
+        <w:instrText xml:space="preserve"> PAGEREF _Toc240904506 \h </w:instrText>
       </w:r>
       <w:r>
         <w:rPr>
@@ -1351,7 +1351,7 @@
         <w:rPr>
           <w:noProof/>
         </w:rPr>
-        <w:t>13</w:t>
+        <w:t>14</w:t>
       </w:r>
       <w:r>
         <w:rPr>
@@ -1394,7 +1394,7 @@
         <w:rPr>
           <w:noProof/>
         </w:rPr>
-        <w:instrText xml:space="preserve"> PAGEREF _Toc240888906 \h </w:instrText>
+        <w:instrText xml:space="preserve"> PAGEREF _Toc240904507 \h </w:instrText>
       </w:r>
       <w:r>
         <w:rPr>
@@ -1411,7 +1411,7 @@
         <w:rPr>
           <w:noProof/>
         </w:rPr>
-        <w:t>13</w:t>
+        <w:t>14</w:t>
       </w:r>
       <w:r>
         <w:rPr>
@@ -1454,7 +1454,7 @@
         <w:rPr>
           <w:noProof/>
         </w:rPr>
-        <w:instrText xml:space="preserve"> PAGEREF _Toc240888907 \h </w:instrText>
+        <w:instrText xml:space="preserve"> PAGEREF _Toc240904508 \h </w:instrText>
       </w:r>
       <w:r>
         <w:rPr>
@@ -1471,7 +1471,7 @@
         <w:rPr>
           <w:noProof/>
         </w:rPr>
-        <w:t>13</w:t>
+        <w:t>14</w:t>
       </w:r>
       <w:r>
         <w:rPr>
@@ -1514,7 +1514,7 @@
         <w:rPr>
           <w:noProof/>
         </w:rPr>
-        <w:instrText xml:space="preserve"> PAGEREF _Toc240888908 \h </w:instrText>
+        <w:instrText xml:space="preserve"> PAGEREF _Toc240904509 \h </w:instrText>
       </w:r>
       <w:r>
         <w:rPr>
@@ -1531,7 +1531,7 @@
         <w:rPr>
           <w:noProof/>
         </w:rPr>
-        <w:t>13</w:t>
+        <w:t>14</w:t>
       </w:r>
       <w:r>
         <w:rPr>
@@ -1574,7 +1574,7 @@
         <w:rPr>
           <w:noProof/>
         </w:rPr>
-        <w:instrText xml:space="preserve"> PAGEREF _Toc240888909 \h </w:instrText>
+        <w:instrText xml:space="preserve"> PAGEREF _Toc240904510 \h </w:instrText>
       </w:r>
       <w:r>
         <w:rPr>
@@ -1591,7 +1591,7 @@
         <w:rPr>
           <w:noProof/>
         </w:rPr>
-        <w:t>14</w:t>
+        <w:t>15</w:t>
       </w:r>
       <w:r>
         <w:rPr>
@@ -1634,7 +1634,7 @@
         <w:rPr>
           <w:noProof/>
         </w:rPr>
-        <w:instrText xml:space="preserve"> PAGEREF _Toc240888910 \h </w:instrText>
+        <w:instrText xml:space="preserve"> PAGEREF _Toc240904511 \h </w:instrText>
       </w:r>
       <w:r>
         <w:rPr>
@@ -1651,7 +1651,7 @@
         <w:rPr>
           <w:noProof/>
         </w:rPr>
-        <w:t>14</w:t>
+        <w:t>15</w:t>
       </w:r>
       <w:r>
         <w:rPr>
@@ -1694,7 +1694,7 @@
         <w:rPr>
           <w:noProof/>
         </w:rPr>
-        <w:instrText xml:space="preserve"> PAGEREF _Toc240888911 \h </w:instrText>
+        <w:instrText xml:space="preserve"> PAGEREF _Toc240904512 \h </w:instrText>
       </w:r>
       <w:r>
         <w:rPr>
@@ -1711,7 +1711,7 @@
         <w:rPr>
           <w:noProof/>
         </w:rPr>
-        <w:t>14</w:t>
+        <w:t>15</w:t>
       </w:r>
       <w:r>
         <w:rPr>
@@ -1754,7 +1754,7 @@
         <w:rPr>
           <w:noProof/>
         </w:rPr>
-        <w:instrText xml:space="preserve"> PAGEREF _Toc240888912 \h </w:instrText>
+        <w:instrText xml:space="preserve"> PAGEREF _Toc240904513 \h </w:instrText>
       </w:r>
       <w:r>
         <w:rPr>
@@ -1771,7 +1771,7 @@
         <w:rPr>
           <w:noProof/>
         </w:rPr>
-        <w:t>15</w:t>
+        <w:t>16</w:t>
       </w:r>
       <w:r>
         <w:rPr>
@@ -1814,7 +1814,7 @@
         <w:rPr>
           <w:noProof/>
         </w:rPr>
-        <w:instrText xml:space="preserve"> PAGEREF _Toc240888913 \h </w:instrText>
+        <w:instrText xml:space="preserve"> PAGEREF _Toc240904514 \h </w:instrText>
       </w:r>
       <w:r>
         <w:rPr>
@@ -1831,7 +1831,7 @@
         <w:rPr>
           <w:noProof/>
         </w:rPr>
-        <w:t>15</w:t>
+        <w:t>16</w:t>
       </w:r>
       <w:r>
         <w:rPr>
@@ -1874,7 +1874,7 @@
         <w:rPr>
           <w:noProof/>
         </w:rPr>
-        <w:instrText xml:space="preserve"> PAGEREF _Toc240888914 \h </w:instrText>
+        <w:instrText xml:space="preserve"> PAGEREF _Toc240904515 \h </w:instrText>
       </w:r>
       <w:r>
         <w:rPr>
@@ -1891,7 +1891,7 @@
         <w:rPr>
           <w:noProof/>
         </w:rPr>
-        <w:t>15</w:t>
+        <w:t>16</w:t>
       </w:r>
       <w:r>
         <w:rPr>
@@ -1934,7 +1934,7 @@
         <w:rPr>
           <w:noProof/>
         </w:rPr>
-        <w:instrText xml:space="preserve"> PAGEREF _Toc240888915 \h </w:instrText>
+        <w:instrText xml:space="preserve"> PAGEREF _Toc240904516 \h </w:instrText>
       </w:r>
       <w:r>
         <w:rPr>
@@ -1951,7 +1951,7 @@
         <w:rPr>
           <w:noProof/>
         </w:rPr>
-        <w:t>15</w:t>
+        <w:t>16</w:t>
       </w:r>
       <w:r>
         <w:rPr>
@@ -1995,7 +1995,7 @@
         <w:rPr>
           <w:noProof/>
         </w:rPr>
-        <w:instrText xml:space="preserve"> PAGEREF _Toc240888916 \h </w:instrText>
+        <w:instrText xml:space="preserve"> PAGEREF _Toc240904517 \h </w:instrText>
       </w:r>
       <w:r>
         <w:rPr>
@@ -2012,7 +2012,7 @@
         <w:rPr>
           <w:noProof/>
         </w:rPr>
-        <w:t>16</w:t>
+        <w:t>17</w:t>
       </w:r>
       <w:r>
         <w:rPr>
@@ -2055,7 +2055,7 @@
         <w:rPr>
           <w:noProof/>
         </w:rPr>
-        <w:instrText xml:space="preserve"> PAGEREF _Toc240888917 \h </w:instrText>
+        <w:instrText xml:space="preserve"> PAGEREF _Toc240904518 \h </w:instrText>
       </w:r>
       <w:r>
         <w:rPr>
@@ -2072,7 +2072,7 @@
         <w:rPr>
           <w:noProof/>
         </w:rPr>
-        <w:t>16</w:t>
+        <w:t>17</w:t>
       </w:r>
       <w:r>
         <w:rPr>
@@ -2115,7 +2115,7 @@
         <w:rPr>
           <w:noProof/>
         </w:rPr>
-        <w:instrText xml:space="preserve"> PAGEREF _Toc240888918 \h </w:instrText>
+        <w:instrText xml:space="preserve"> PAGEREF _Toc240904519 \h </w:instrText>
       </w:r>
       <w:r>
         <w:rPr>
@@ -2132,7 +2132,7 @@
         <w:rPr>
           <w:noProof/>
         </w:rPr>
-        <w:t>16</w:t>
+        <w:t>17</w:t>
       </w:r>
       <w:r>
         <w:rPr>
@@ -2175,7 +2175,7 @@
         <w:rPr>
           <w:noProof/>
         </w:rPr>
-        <w:instrText xml:space="preserve"> PAGEREF _Toc240888919 \h </w:instrText>
+        <w:instrText xml:space="preserve"> PAGEREF _Toc240904520 \h </w:instrText>
       </w:r>
       <w:r>
         <w:rPr>
@@ -2192,7 +2192,7 @@
         <w:rPr>
           <w:noProof/>
         </w:rPr>
-        <w:t>16</w:t>
+        <w:t>17</w:t>
       </w:r>
       <w:r>
         <w:rPr>
@@ -2235,7 +2235,7 @@
         <w:rPr>
           <w:noProof/>
         </w:rPr>
-        <w:instrText xml:space="preserve"> PAGEREF _Toc240888920 \h </w:instrText>
+        <w:instrText xml:space="preserve"> PAGEREF _Toc240904521 \h </w:instrText>
       </w:r>
       <w:r>
         <w:rPr>
@@ -2252,7 +2252,7 @@
         <w:rPr>
           <w:noProof/>
         </w:rPr>
-        <w:t>16</w:t>
+        <w:t>17</w:t>
       </w:r>
       <w:r>
         <w:rPr>
@@ -2295,7 +2295,7 @@
         <w:rPr>
           <w:noProof/>
         </w:rPr>
-        <w:instrText xml:space="preserve"> PAGEREF _Toc240888921 \h </w:instrText>
+        <w:instrText xml:space="preserve"> PAGEREF _Toc240904522 \h </w:instrText>
       </w:r>
       <w:r>
         <w:rPr>
@@ -2312,7 +2312,7 @@
         <w:rPr>
           <w:noProof/>
         </w:rPr>
-        <w:t>17</w:t>
+        <w:t>18</w:t>
       </w:r>
       <w:r>
         <w:rPr>
@@ -2355,7 +2355,7 @@
         <w:rPr>
           <w:noProof/>
         </w:rPr>
-        <w:instrText xml:space="preserve"> PAGEREF _Toc240888922 \h </w:instrText>
+        <w:instrText xml:space="preserve"> PAGEREF _Toc240904523 \h </w:instrText>
       </w:r>
       <w:r>
         <w:rPr>
@@ -2372,7 +2372,7 @@
         <w:rPr>
           <w:noProof/>
         </w:rPr>
-        <w:t>17</w:t>
+        <w:t>18</w:t>
       </w:r>
       <w:r>
         <w:rPr>
@@ -2415,7 +2415,7 @@
         <w:rPr>
           <w:noProof/>
         </w:rPr>
-        <w:instrText xml:space="preserve"> PAGEREF _Toc240888923 \h </w:instrText>
+        <w:instrText xml:space="preserve"> PAGEREF _Toc240904524 \h </w:instrText>
       </w:r>
       <w:r>
         <w:rPr>
@@ -2432,7 +2432,7 @@
         <w:rPr>
           <w:noProof/>
         </w:rPr>
-        <w:t>17</w:t>
+        <w:t>18</w:t>
       </w:r>
       <w:r>
         <w:rPr>
@@ -2475,7 +2475,7 @@
         <w:rPr>
           <w:noProof/>
         </w:rPr>
-        <w:instrText xml:space="preserve"> PAGEREF _Toc240888924 \h </w:instrText>
+        <w:instrText xml:space="preserve"> PAGEREF _Toc240904525 \h </w:instrText>
       </w:r>
       <w:r>
         <w:rPr>
@@ -2492,7 +2492,7 @@
         <w:rPr>
           <w:noProof/>
         </w:rPr>
-        <w:t>18</w:t>
+        <w:t>19</w:t>
       </w:r>
       <w:r>
         <w:rPr>
@@ -2535,7 +2535,7 @@
         <w:rPr>
           <w:noProof/>
         </w:rPr>
-        <w:instrText xml:space="preserve"> PAGEREF _Toc240888925 \h </w:instrText>
+        <w:instrText xml:space="preserve"> PAGEREF _Toc240904526 \h </w:instrText>
       </w:r>
       <w:r>
         <w:rPr>
@@ -2552,7 +2552,7 @@
         <w:rPr>
           <w:noProof/>
         </w:rPr>
-        <w:t>18</w:t>
+        <w:t>19</w:t>
       </w:r>
       <w:r>
         <w:rPr>
@@ -2595,7 +2595,7 @@
         <w:rPr>
           <w:noProof/>
         </w:rPr>
-        <w:instrText xml:space="preserve"> PAGEREF _Toc240888926 \h </w:instrText>
+        <w:instrText xml:space="preserve"> PAGEREF _Toc240904527 \h </w:instrText>
       </w:r>
       <w:r>
         <w:rPr>
@@ -2612,7 +2612,7 @@
         <w:rPr>
           <w:noProof/>
         </w:rPr>
-        <w:t>19</w:t>
+        <w:t>20</w:t>
       </w:r>
       <w:r>
         <w:rPr>
@@ -2655,7 +2655,7 @@
         <w:rPr>
           <w:noProof/>
         </w:rPr>
-        <w:instrText xml:space="preserve"> PAGEREF _Toc240888927 \h </w:instrText>
+        <w:instrText xml:space="preserve"> PAGEREF _Toc240904528 \h </w:instrText>
       </w:r>
       <w:r>
         <w:rPr>
@@ -2672,7 +2672,7 @@
         <w:rPr>
           <w:noProof/>
         </w:rPr>
-        <w:t>19</w:t>
+        <w:t>20</w:t>
       </w:r>
       <w:r>
         <w:rPr>
@@ -2715,7 +2715,7 @@
         <w:rPr>
           <w:noProof/>
         </w:rPr>
-        <w:instrText xml:space="preserve"> PAGEREF _Toc240888928 \h </w:instrText>
+        <w:instrText xml:space="preserve"> PAGEREF _Toc240904529 \h </w:instrText>
       </w:r>
       <w:r>
         <w:rPr>
@@ -2732,7 +2732,7 @@
         <w:rPr>
           <w:noProof/>
         </w:rPr>
-        <w:t>19</w:t>
+        <w:t>20</w:t>
       </w:r>
       <w:r>
         <w:rPr>
@@ -2775,7 +2775,7 @@
         <w:rPr>
           <w:noProof/>
         </w:rPr>
-        <w:instrText xml:space="preserve"> PAGEREF _Toc240888929 \h </w:instrText>
+        <w:instrText xml:space="preserve"> PAGEREF _Toc240904530 \h </w:instrText>
       </w:r>
       <w:r>
         <w:rPr>
@@ -2792,7 +2792,7 @@
         <w:rPr>
           <w:noProof/>
         </w:rPr>
-        <w:t>19</w:t>
+        <w:t>20</w:t>
       </w:r>
       <w:r>
         <w:rPr>
@@ -2835,7 +2835,7 @@
         <w:rPr>
           <w:noProof/>
         </w:rPr>
-        <w:instrText xml:space="preserve"> PAGEREF _Toc240888930 \h </w:instrText>
+        <w:instrText xml:space="preserve"> PAGEREF _Toc240904531 \h </w:instrText>
       </w:r>
       <w:r>
         <w:rPr>
@@ -2852,7 +2852,7 @@
         <w:rPr>
           <w:noProof/>
         </w:rPr>
-        <w:t>20</w:t>
+        <w:t>21</w:t>
       </w:r>
       <w:r>
         <w:rPr>
@@ -2895,7 +2895,7 @@
         <w:rPr>
           <w:noProof/>
         </w:rPr>
-        <w:instrText xml:space="preserve"> PAGEREF _Toc240888931 \h </w:instrText>
+        <w:instrText xml:space="preserve"> PAGEREF _Toc240904532 \h </w:instrText>
       </w:r>
       <w:r>
         <w:rPr>
@@ -2912,7 +2912,7 @@
         <w:rPr>
           <w:noProof/>
         </w:rPr>
-        <w:t>20</w:t>
+        <w:t>21</w:t>
       </w:r>
       <w:r>
         <w:rPr>
@@ -2955,7 +2955,7 @@
         <w:rPr>
           <w:noProof/>
         </w:rPr>
-        <w:instrText xml:space="preserve"> PAGEREF _Toc240888932 \h </w:instrText>
+        <w:instrText xml:space="preserve"> PAGEREF _Toc240904533 \h </w:instrText>
       </w:r>
       <w:r>
         <w:rPr>
@@ -2972,7 +2972,127 @@
         <w:rPr>
           <w:noProof/>
         </w:rPr>
-        <w:t>20</w:t>
+        <w:t>21</w:t>
+      </w:r>
+      <w:r>
+        <w:rPr>
+          <w:noProof/>
+        </w:rPr>
+        <w:fldChar w:fldCharType="end"/>
+      </w:r>
+    </w:p>
+    <w:p>
+      <w:pPr>
+        <w:pStyle w:val="Verzeichnis3"/>
+        <w:tabs>
+          <w:tab w:val="right" w:leader="dot" w:pos="9401"/>
+        </w:tabs>
+        <w:rPr>
+          <w:rFonts w:eastAsiaTheme="minorEastAsia"/>
+          <w:noProof/>
+          <w:lang w:eastAsia="de-DE"/>
+        </w:rPr>
+      </w:pPr>
+      <w:r>
+        <w:rPr>
+          <w:noProof/>
+        </w:rPr>
+        <w:t>Abschlagszahlungen zu festen Terminen</w:t>
+      </w:r>
+      <w:r>
+        <w:rPr>
+          <w:noProof/>
+        </w:rPr>
+        <w:tab/>
+      </w:r>
+      <w:r>
+        <w:rPr>
+          <w:noProof/>
+        </w:rPr>
+        <w:fldChar w:fldCharType="begin"/>
+      </w:r>
+      <w:r>
+        <w:rPr>
+          <w:noProof/>
+        </w:rPr>
+        <w:instrText xml:space="preserve"> PAGEREF _Toc240904534 \h </w:instrText>
+      </w:r>
+      <w:r>
+        <w:rPr>
+          <w:noProof/>
+        </w:rPr>
+      </w:r>
+      <w:r>
+        <w:rPr>
+          <w:noProof/>
+        </w:rPr>
+        <w:fldChar w:fldCharType="separate"/>
+      </w:r>
+      <w:r>
+        <w:rPr>
+          <w:noProof/>
+        </w:rPr>
+        <w:t>22</w:t>
+      </w:r>
+      <w:r>
+        <w:rPr>
+          <w:noProof/>
+        </w:rPr>
+        <w:fldChar w:fldCharType="end"/>
+      </w:r>
+    </w:p>
+    <w:p>
+      <w:pPr>
+        <w:pStyle w:val="Verzeichnis3"/>
+        <w:tabs>
+          <w:tab w:val="right" w:leader="dot" w:pos="9401"/>
+        </w:tabs>
+        <w:rPr>
+          <w:rFonts w:eastAsiaTheme="minorEastAsia"/>
+          <w:noProof/>
+          <w:lang w:eastAsia="de-DE"/>
+        </w:rPr>
+      </w:pPr>
+      <w:r>
+        <w:rPr>
+          <w:noProof/>
+        </w:rPr>
+        <w:t>Wenn Sie das Blatt mit offenen Angaben verlassen</w:t>
+      </w:r>
+      <w:r>
+        <w:rPr>
+          <w:noProof/>
+        </w:rPr>
+        <w:tab/>
+      </w:r>
+      <w:r>
+        <w:rPr>
+          <w:noProof/>
+        </w:rPr>
+        <w:fldChar w:fldCharType="begin"/>
+      </w:r>
+      <w:r>
+        <w:rPr>
+          <w:noProof/>
+        </w:rPr>
+        <w:instrText xml:space="preserve"> PAGEREF _Toc240904535 \h </w:instrText>
+      </w:r>
+      <w:r>
+        <w:rPr>
+          <w:noProof/>
+        </w:rPr>
+      </w:r>
+      <w:r>
+        <w:rPr>
+          <w:noProof/>
+        </w:rPr>
+        <w:fldChar w:fldCharType="separate"/>
+      </w:r>
+      <w:r>
+        <w:rPr>
+          <w:noProof/>
+        </w:rPr>
+        <w:t>22</w:t>
       </w:r>
       <w:r>
         <w:rPr>
@@ -3015,7 +3135,7 @@
         <w:rPr>
           <w:noProof/>
         </w:rPr>
-        <w:instrText xml:space="preserve"> PAGEREF _Toc240888933 \h </w:instrText>
+        <w:instrText xml:space="preserve"> PAGEREF _Toc240904536 \h </w:instrText>
       </w:r>
       <w:r>
         <w:rPr>
@@ -3032,7 +3152,7 @@
         <w:rPr>
           <w:noProof/>
         </w:rPr>
-        <w:t>20</w:t>
+        <w:t>22</w:t>
       </w:r>
       <w:r>
         <w:rPr>
@@ -3075,7 +3195,7 @@
         <w:rPr>
           <w:noProof/>
         </w:rPr>
-        <w:instrText xml:space="preserve"> PAGEREF _Toc240888934 \h </w:instrText>
+        <w:instrText xml:space="preserve"> PAGEREF _Toc240904537 \h </w:instrText>
       </w:r>
       <w:r>
         <w:rPr>
@@ -3092,7 +3212,7 @@
         <w:rPr>
           <w:noProof/>
         </w:rPr>
-        <w:t>21</w:t>
+        <w:t>23</w:t>
       </w:r>
       <w:r>
         <w:rPr>
@@ -3135,7 +3255,7 @@
         <w:rPr>
           <w:noProof/>
         </w:rPr>
-        <w:instrText xml:space="preserve"> PAGEREF _Toc240888935 \h </w:instrText>
+        <w:instrText xml:space="preserve"> PAGEREF _Toc240904538 \h </w:instrText>
       </w:r>
       <w:r>
         <w:rPr>
@@ -3152,7 +3272,7 @@
         <w:rPr>
           <w:noProof/>
         </w:rPr>
-        <w:t>21</w:t>
+        <w:t>23</w:t>
       </w:r>
       <w:r>
         <w:rPr>
@@ -3195,7 +3315,7 @@
         <w:rPr>
           <w:noProof/>
         </w:rPr>
-        <w:instrText xml:space="preserve"> PAGEREF _Toc240888936 \h </w:instrText>
+        <w:instrText xml:space="preserve"> PAGEREF _Toc240904539 \h </w:instrText>
       </w:r>
       <w:r>
         <w:rPr>
@@ -3212,7 +3332,7 @@
         <w:rPr>
           <w:noProof/>
         </w:rPr>
-        <w:t>21</w:t>
+        <w:t>23</w:t>
       </w:r>
       <w:r>
         <w:rPr>
@@ -3255,7 +3375,7 @@
         <w:rPr>
           <w:noProof/>
         </w:rPr>
-        <w:instrText xml:space="preserve"> PAGEREF _Toc240888937 \h </w:instrText>
+        <w:instrText xml:space="preserve"> PAGEREF _Toc240904540 \h </w:instrText>
       </w:r>
       <w:r>
         <w:rPr>
@@ -3272,7 +3392,7 @@
         <w:rPr>
           <w:noProof/>
         </w:rPr>
-        <w:t>22</w:t>
+        <w:t>23</w:t>
       </w:r>
       <w:r>
         <w:rPr>
@@ -3315,7 +3435,7 @@
         <w:rPr>
           <w:noProof/>
         </w:rPr>
-        <w:instrText xml:space="preserve"> PAGEREF _Toc240888938 \h </w:instrText>
+        <w:instrText xml:space="preserve"> PAGEREF _Toc240904541 \h </w:instrText>
       </w:r>
       <w:r>
         <w:rPr>
@@ -3332,7 +3452,7 @@
         <w:rPr>
           <w:noProof/>
         </w:rPr>
-        <w:t>23</w:t>
+        <w:t>24</w:t>
       </w:r>
       <w:r>
         <w:rPr>
@@ -3375,7 +3495,7 @@
         <w:rPr>
           <w:noProof/>
         </w:rPr>
-        <w:instrText xml:space="preserve"> PAGEREF _Toc240888939 \h </w:instrText>
+        <w:instrText xml:space="preserve"> PAGEREF _Toc240904542 \h </w:instrText>
       </w:r>
       <w:r>
         <w:rPr>
@@ -3392,7 +3512,7 @@
         <w:rPr>
           <w:noProof/>
         </w:rPr>
-        <w:t>23</w:t>
+        <w:t>24</w:t>
       </w:r>
       <w:r>
         <w:rPr>
@@ -3435,7 +3555,7 @@
         <w:rPr>
           <w:noProof/>
         </w:rPr>
-        <w:instrText xml:space="preserve"> PAGEREF _Toc240888940 \h </w:instrText>
+        <w:instrText xml:space="preserve"> PAGEREF _Toc240904543 \h </w:instrText>
       </w:r>
       <w:r>
         <w:rPr>
@@ -3452,7 +3572,7 @@
         <w:rPr>
           <w:noProof/>
         </w:rPr>
-        <w:t>23</w:t>
+        <w:t>24</w:t>
       </w:r>
       <w:r>
         <w:rPr>
@@ -3495,7 +3615,7 @@
         <w:rPr>
           <w:noProof/>
         </w:rPr>
-        <w:instrText xml:space="preserve"> PAGEREF _Toc240888941 \h </w:instrText>
+        <w:instrText xml:space="preserve"> PAGEREF _Toc240904544 \h </w:instrText>
       </w:r>
       <w:r>
         <w:rPr>
@@ -3512,7 +3632,7 @@
         <w:rPr>
           <w:noProof/>
         </w:rPr>
-        <w:t>24</w:t>
+        <w:t>25</w:t>
       </w:r>
       <w:r>
         <w:rPr>
@@ -3555,7 +3675,7 @@
         <w:rPr>
           <w:noProof/>
         </w:rPr>
-        <w:instrText xml:space="preserve"> PAGEREF _Toc240888942 \h </w:instrText>
+        <w:instrText xml:space="preserve"> PAGEREF _Toc240904545 \h </w:instrText>
       </w:r>
       <w:r>
         <w:rPr>
@@ -3572,7 +3692,67 @@
         <w:rPr>
           <w:noProof/>
         </w:rPr>
-        <w:t>24</w:t>
+        <w:t>25</w:t>
+      </w:r>
+      <w:r>
+        <w:rPr>
+          <w:noProof/>
+        </w:rPr>
+        <w:fldChar w:fldCharType="end"/>
+      </w:r>
+    </w:p>
+    <w:p>
+      <w:pPr>
+        <w:pStyle w:val="Verzeichnis3"/>
+        <w:tabs>
+          <w:tab w:val="right" w:leader="dot" w:pos="9401"/>
+        </w:tabs>
+        <w:rPr>
+          <w:rFonts w:eastAsiaTheme="minorEastAsia"/>
+          <w:noProof/>
+          <w:lang w:eastAsia="de-DE"/>
+        </w:rPr>
+      </w:pPr>
+      <w:r>
+        <w:rPr>
+          <w:noProof/>
+        </w:rPr>
+        <w:t>Wenn Sie das Blatt mit leeren Feldern verlassen</w:t>
+      </w:r>
+      <w:r>
+        <w:rPr>
+          <w:noProof/>
+        </w:rPr>
+        <w:tab/>
+      </w:r>
+      <w:r>
+        <w:rPr>
+          <w:noProof/>
+        </w:rPr>
+        <w:fldChar w:fldCharType="begin"/>
+      </w:r>
+      <w:r>
+        <w:rPr>
+          <w:noProof/>
+        </w:rPr>
+        <w:instrText xml:space="preserve"> PAGEREF _Toc240904546 \h </w:instrText>
+      </w:r>
+      <w:r>
+        <w:rPr>
+          <w:noProof/>
+        </w:rPr>
+      </w:r>
+      <w:r>
+        <w:rPr>
+          <w:noProof/>
+        </w:rPr>
+        <w:fldChar w:fldCharType="separate"/>
+      </w:r>
+      <w:r>
+        <w:rPr>
+          <w:noProof/>
+        </w:rPr>
+        <w:t>25</w:t>
       </w:r>
       <w:r>
         <w:rPr>
@@ -3597,7 +3777,7 @@
         <w:rPr>
           <w:noProof/>
         </w:rPr>
-        <w:t>8.2 Die Ampel in Spalte G</w:t>
+        <w:t>8.2 Die Sortierung</w:t>
       </w:r>
       <w:r>
         <w:rPr>
@@ -3615,7 +3795,7 @@
         <w:rPr>
           <w:noProof/>
         </w:rPr>
-        <w:instrText xml:space="preserve"> PAGEREF _Toc240888943 \h </w:instrText>
+        <w:instrText xml:space="preserve"> PAGEREF _Toc240904547 \h </w:instrText>
       </w:r>
       <w:r>
         <w:rPr>
@@ -3632,7 +3812,7 @@
         <w:rPr>
           <w:noProof/>
         </w:rPr>
-        <w:t>24</w:t>
+        <w:t>25</w:t>
       </w:r>
       <w:r>
         <w:rPr>
@@ -3657,7 +3837,7 @@
         <w:rPr>
           <w:noProof/>
         </w:rPr>
-        <w:t>8.3 Säumnisgebühren</w:t>
+        <w:t>8.3 Ehrenmitglieder</w:t>
       </w:r>
       <w:r>
         <w:rPr>
@@ -3675,7 +3855,7 @@
         <w:rPr>
           <w:noProof/>
         </w:rPr>
-        <w:instrText xml:space="preserve"> PAGEREF _Toc240888944 \h </w:instrText>
+        <w:instrText xml:space="preserve"> PAGEREF _Toc240904548 \h </w:instrText>
       </w:r>
       <w:r>
         <w:rPr>
@@ -3692,7 +3872,7 @@
         <w:rPr>
           <w:noProof/>
         </w:rPr>
-        <w:t>24</w:t>
+        <w:t>25</w:t>
       </w:r>
       <w:r>
         <w:rPr>
@@ -3717,7 +3897,7 @@
         <w:rPr>
           <w:noProof/>
         </w:rPr>
-        <w:t>8.4 Guthaben</w:t>
+        <w:t>8.4 Die Ampel in Spalte G</w:t>
       </w:r>
       <w:r>
         <w:rPr>
@@ -3735,7 +3915,7 @@
         <w:rPr>
           <w:noProof/>
         </w:rPr>
-        <w:instrText xml:space="preserve"> PAGEREF _Toc240888945 \h </w:instrText>
+        <w:instrText xml:space="preserve"> PAGEREF _Toc240904549 \h </w:instrText>
       </w:r>
       <w:r>
         <w:rPr>
@@ -3752,7 +3932,128 @@
         <w:rPr>
           <w:noProof/>
         </w:rPr>
-        <w:t>24</w:t>
+        <w:t>25</w:t>
+      </w:r>
+      <w:r>
+        <w:rPr>
+          <w:noProof/>
+        </w:rPr>
+        <w:fldChar w:fldCharType="end"/>
+      </w:r>
+    </w:p>
+    <w:p>
+      <w:pPr>
+        <w:pStyle w:val="Verzeichnis2"/>
+        <w:tabs>
+          <w:tab w:val="right" w:leader="dot" w:pos="9401"/>
+        </w:tabs>
+        <w:rPr>
+          <w:rFonts w:eastAsiaTheme="minorEastAsia"/>
+          <w:noProof/>
+          <w:lang w:eastAsia="de-DE"/>
+        </w:rPr>
+      </w:pPr>
+      <w:r>
+        <w:rPr>
+          <w:noProof/>
+        </w:rPr>
+        <w:lastRenderedPageBreak/>
+        <w:t>8.5 Säumnisgebühren</w:t>
+      </w:r>
+      <w:r>
+        <w:rPr>
+          <w:noProof/>
+        </w:rPr>
+        <w:tab/>
+      </w:r>
+      <w:r>
+        <w:rPr>
+          <w:noProof/>
+        </w:rPr>
+        <w:fldChar w:fldCharType="begin"/>
+      </w:r>
+      <w:r>
+        <w:rPr>
+          <w:noProof/>
+        </w:rPr>
+        <w:instrText xml:space="preserve"> PAGEREF _Toc240904550 \h </w:instrText>
+      </w:r>
+      <w:r>
+        <w:rPr>
+          <w:noProof/>
+        </w:rPr>
+      </w:r>
+      <w:r>
+        <w:rPr>
+          <w:noProof/>
+        </w:rPr>
+        <w:fldChar w:fldCharType="separate"/>
+      </w:r>
+      <w:r>
+        <w:rPr>
+          <w:noProof/>
+        </w:rPr>
+        <w:t>26</w:t>
+      </w:r>
+      <w:r>
+        <w:rPr>
+          <w:noProof/>
+        </w:rPr>
+        <w:fldChar w:fldCharType="end"/>
+      </w:r>
+    </w:p>
+    <w:p>
+      <w:pPr>
+        <w:pStyle w:val="Verzeichnis2"/>
+        <w:tabs>
+          <w:tab w:val="right" w:leader="dot" w:pos="9401"/>
+        </w:tabs>
+        <w:rPr>
+          <w:rFonts w:eastAsiaTheme="minorEastAsia"/>
+          <w:noProof/>
+          <w:lang w:eastAsia="de-DE"/>
+        </w:rPr>
+      </w:pPr>
+      <w:r>
+        <w:rPr>
+          <w:noProof/>
+        </w:rPr>
+        <w:t>8.6 Guthaben</w:t>
+      </w:r>
+      <w:r>
+        <w:rPr>
+          <w:noProof/>
+        </w:rPr>
+        <w:tab/>
+      </w:r>
+      <w:r>
+        <w:rPr>
+          <w:noProof/>
+        </w:rPr>
+        <w:fldChar w:fldCharType="begin"/>
+      </w:r>
+      <w:r>
+        <w:rPr>
+          <w:noProof/>
+        </w:rPr>
+        <w:instrText xml:space="preserve"> PAGEREF _Toc240904551 \h </w:instrText>
+      </w:r>
+      <w:r>
+        <w:rPr>
+          <w:noProof/>
+        </w:rPr>
+      </w:r>
+      <w:r>
+        <w:rPr>
+          <w:noProof/>
+        </w:rPr>
+        <w:fldChar w:fldCharType="separate"/>
+      </w:r>
+      <w:r>
+        <w:rPr>
+          <w:noProof/>
+        </w:rPr>
+        <w:t>26</w:t>
       </w:r>
       <w:r>
         <w:rPr>
@@ -3795,7 +4096,7 @@
         <w:rPr>
           <w:noProof/>
         </w:rPr>
-        <w:instrText xml:space="preserve"> PAGEREF _Toc240888946 \h </w:instrText>
+        <w:instrText xml:space="preserve"> PAGEREF _Toc240904552 \h </w:instrText>
       </w:r>
       <w:r>
         <w:rPr>
@@ -3812,7 +4113,7 @@
         <w:rPr>
           <w:noProof/>
         </w:rPr>
-        <w:t>24</w:t>
+        <w:t>26</w:t>
       </w:r>
       <w:r>
         <w:rPr>
@@ -3837,7 +4138,7 @@
         <w:rPr>
           <w:noProof/>
         </w:rPr>
-        <w:t>8.5 Eine gespeicherte Entscheidung zurücknehmen</w:t>
+        <w:t>8.7 Eine gespeicherte Entscheidung zurücknehmen</w:t>
       </w:r>
       <w:r>
         <w:rPr>
@@ -3855,7 +4156,7 @@
         <w:rPr>
           <w:noProof/>
         </w:rPr>
-        <w:instrText xml:space="preserve"> PAGEREF _Toc240888947 \h </w:instrText>
+        <w:instrText xml:space="preserve"> PAGEREF _Toc240904553 \h </w:instrText>
       </w:r>
       <w:r>
         <w:rPr>
@@ -3872,7 +4173,7 @@
         <w:rPr>
           <w:noProof/>
         </w:rPr>
-        <w:t>25</w:t>
+        <w:t>27</w:t>
       </w:r>
       <w:r>
         <w:rPr>
@@ -3897,7 +4198,7 @@
         <w:rPr>
           <w:noProof/>
         </w:rPr>
-        <w:t>8.6 Austritt, Todesfall und Erbfall</w:t>
+        <w:t>8.8 Austritt, Todesfall und Erbfall</w:t>
       </w:r>
       <w:r>
         <w:rPr>
@@ -3915,7 +4216,7 @@
         <w:rPr>
           <w:noProof/>
         </w:rPr>
-        <w:instrText xml:space="preserve"> PAGEREF _Toc240888948 \h </w:instrText>
+        <w:instrText xml:space="preserve"> PAGEREF _Toc240904554 \h </w:instrText>
       </w:r>
       <w:r>
         <w:rPr>
@@ -3932,7 +4233,7 @@
         <w:rPr>
           <w:noProof/>
         </w:rPr>
-        <w:t>25</w:t>
+        <w:t>27</w:t>
       </w:r>
       <w:r>
         <w:rPr>
@@ -3957,7 +4258,6 @@
         <w:rPr>
           <w:noProof/>
         </w:rPr>
-        <w:lastRenderedPageBreak/>
         <w:t>Im Jahr des Austritts</w:t>
       </w:r>
       <w:r>
@@ -3976,7 +4276,7 @@
         <w:rPr>
           <w:noProof/>
         </w:rPr>
-        <w:instrText xml:space="preserve"> PAGEREF _Toc240888949 \h </w:instrText>
+        <w:instrText xml:space="preserve"> PAGEREF _Toc240904555 \h </w:instrText>
       </w:r>
       <w:r>
         <w:rPr>
@@ -3993,7 +4293,7 @@
         <w:rPr>
           <w:noProof/>
         </w:rPr>
-        <w:t>25</w:t>
+        <w:t>27</w:t>
       </w:r>
       <w:r>
         <w:rPr>
@@ -4036,7 +4336,7 @@
         <w:rPr>
           <w:noProof/>
         </w:rPr>
-        <w:instrText xml:space="preserve"> PAGEREF _Toc240888950 \h </w:instrText>
+        <w:instrText xml:space="preserve"> PAGEREF _Toc240904556 \h </w:instrText>
       </w:r>
       <w:r>
         <w:rPr>
@@ -4053,7 +4353,7 @@
         <w:rPr>
           <w:noProof/>
         </w:rPr>
-        <w:t>25</w:t>
+        <w:t>27</w:t>
       </w:r>
       <w:r>
         <w:rPr>
@@ -4096,7 +4396,7 @@
         <w:rPr>
           <w:noProof/>
         </w:rPr>
-        <w:instrText xml:space="preserve"> PAGEREF _Toc240888951 \h </w:instrText>
+        <w:instrText xml:space="preserve"> PAGEREF _Toc240904557 \h </w:instrText>
       </w:r>
       <w:r>
         <w:rPr>
@@ -4113,7 +4413,7 @@
         <w:rPr>
           <w:noProof/>
         </w:rPr>
-        <w:t>25</w:t>
+        <w:t>27</w:t>
       </w:r>
       <w:r>
         <w:rPr>
@@ -4156,7 +4456,7 @@
         <w:rPr>
           <w:noProof/>
         </w:rPr>
-        <w:instrText xml:space="preserve"> PAGEREF _Toc240888952 \h </w:instrText>
+        <w:instrText xml:space="preserve"> PAGEREF _Toc240904558 \h </w:instrText>
       </w:r>
       <w:r>
         <w:rPr>
@@ -4173,7 +4473,7 @@
         <w:rPr>
           <w:noProof/>
         </w:rPr>
-        <w:t>27</w:t>
+        <w:t>29</w:t>
       </w:r>
       <w:r>
         <w:rPr>
@@ -4216,7 +4516,7 @@
         <w:rPr>
           <w:noProof/>
         </w:rPr>
-        <w:instrText xml:space="preserve"> PAGEREF _Toc240888953 \h </w:instrText>
+        <w:instrText xml:space="preserve"> PAGEREF _Toc240904559 \h </w:instrText>
       </w:r>
       <w:r>
         <w:rPr>
@@ -4233,7 +4533,67 @@
         <w:rPr>
           <w:noProof/>
         </w:rPr>
-        <w:t>28</w:t>
+        <w:t>30</w:t>
+      </w:r>
+      <w:r>
+        <w:rPr>
+          <w:noProof/>
+        </w:rPr>
+        <w:fldChar w:fldCharType="end"/>
+      </w:r>
+    </w:p>
+    <w:p>
+      <w:pPr>
+        <w:pStyle w:val="Verzeichnis2"/>
+        <w:tabs>
+          <w:tab w:val="right" w:leader="dot" w:pos="9401"/>
+        </w:tabs>
+        <w:rPr>
+          <w:rFonts w:eastAsiaTheme="minorEastAsia"/>
+          <w:noProof/>
+          <w:lang w:eastAsia="de-DE"/>
+        </w:rPr>
+      </w:pPr>
+      <w:r>
+        <w:rPr>
+          <w:noProof/>
+        </w:rPr>
+        <w:t>10.1 Bargeld vom Konto in die Kasse</w:t>
+      </w:r>
+      <w:r>
+        <w:rPr>
+          <w:noProof/>
+        </w:rPr>
+        <w:tab/>
+      </w:r>
+      <w:r>
+        <w:rPr>
+          <w:noProof/>
+        </w:rPr>
+        <w:fldChar w:fldCharType="begin"/>
+      </w:r>
+      <w:r>
+        <w:rPr>
+          <w:noProof/>
+        </w:rPr>
+        <w:instrText xml:space="preserve"> PAGEREF _Toc240904560 \h </w:instrText>
+      </w:r>
+      <w:r>
+        <w:rPr>
+          <w:noProof/>
+        </w:rPr>
+      </w:r>
+      <w:r>
+        <w:rPr>
+          <w:noProof/>
+        </w:rPr>
+        <w:fldChar w:fldCharType="separate"/>
+      </w:r>
+      <w:r>
+        <w:rPr>
+          <w:noProof/>
+        </w:rPr>
+        <w:t>30</w:t>
       </w:r>
       <w:r>
         <w:rPr>
@@ -4276,7 +4636,7 @@
         <w:rPr>
           <w:noProof/>
         </w:rPr>
-        <w:instrText xml:space="preserve"> PAGEREF _Toc240888954 \h </w:instrText>
+        <w:instrText xml:space="preserve"> PAGEREF _Toc240904561 \h </w:instrText>
       </w:r>
       <w:r>
         <w:rPr>
@@ -4293,7 +4653,7 @@
         <w:rPr>
           <w:noProof/>
         </w:rPr>
-        <w:t>29</w:t>
+        <w:t>32</w:t>
       </w:r>
       <w:r>
         <w:rPr>
@@ -4336,7 +4696,7 @@
         <w:rPr>
           <w:noProof/>
         </w:rPr>
-        <w:instrText xml:space="preserve"> PAGEREF _Toc240888955 \h </w:instrText>
+        <w:instrText xml:space="preserve"> PAGEREF _Toc240904562 \h </w:instrText>
       </w:r>
       <w:r>
         <w:rPr>
@@ -4353,7 +4713,7 @@
         <w:rPr>
           <w:noProof/>
         </w:rPr>
-        <w:t>29</w:t>
+        <w:t>32</w:t>
       </w:r>
       <w:r>
         <w:rPr>
@@ -4396,7 +4756,7 @@
         <w:rPr>
           <w:noProof/>
         </w:rPr>
-        <w:instrText xml:space="preserve"> PAGEREF _Toc240888956 \h </w:instrText>
+        <w:instrText xml:space="preserve"> PAGEREF _Toc240904563 \h </w:instrText>
       </w:r>
       <w:r>
         <w:rPr>
@@ -4413,7 +4773,7 @@
         <w:rPr>
           <w:noProof/>
         </w:rPr>
-        <w:t>30</w:t>
+        <w:t>33</w:t>
       </w:r>
       <w:r>
         <w:rPr>
@@ -4456,7 +4816,7 @@
         <w:rPr>
           <w:noProof/>
         </w:rPr>
-        <w:instrText xml:space="preserve"> PAGEREF _Toc240888957 \h </w:instrText>
+        <w:instrText xml:space="preserve"> PAGEREF _Toc240904564 \h </w:instrText>
       </w:r>
       <w:r>
         <w:rPr>
@@ -4473,7 +4833,7 @@
         <w:rPr>
           <w:noProof/>
         </w:rPr>
-        <w:t>31</w:t>
+        <w:t>34</w:t>
       </w:r>
       <w:r>
         <w:rPr>
@@ -4516,7 +4876,7 @@
         <w:rPr>
           <w:noProof/>
         </w:rPr>
-        <w:instrText xml:space="preserve"> PAGEREF _Toc240888958 \h </w:instrText>
+        <w:instrText xml:space="preserve"> PAGEREF _Toc240904565 \h </w:instrText>
       </w:r>
       <w:r>
         <w:rPr>
@@ -4533,7 +4893,7 @@
         <w:rPr>
           <w:noProof/>
         </w:rPr>
-        <w:t>32</w:t>
+        <w:t>35</w:t>
       </w:r>
       <w:r>
         <w:rPr>
@@ -4576,7 +4936,7 @@
         <w:rPr>
           <w:noProof/>
         </w:rPr>
-        <w:instrText xml:space="preserve"> PAGEREF _Toc240888959 \h </w:instrText>
+        <w:instrText xml:space="preserve"> PAGEREF _Toc240904566 \h </w:instrText>
       </w:r>
       <w:r>
         <w:rPr>
@@ -4593,7 +4953,7 @@
         <w:rPr>
           <w:noProof/>
         </w:rPr>
-        <w:t>32</w:t>
+        <w:t>35</w:t>
       </w:r>
       <w:r>
         <w:rPr>
@@ -4636,7 +4996,7 @@
         <w:rPr>
           <w:noProof/>
         </w:rPr>
-        <w:instrText xml:space="preserve"> PAGEREF _Toc240888960 \h </w:instrText>
+        <w:instrText xml:space="preserve"> PAGEREF _Toc240904567 \h </w:instrText>
       </w:r>
       <w:r>
         <w:rPr>
@@ -4653,7 +5013,7 @@
         <w:rPr>
           <w:noProof/>
         </w:rPr>
-        <w:t>32</w:t>
+        <w:t>35</w:t>
       </w:r>
       <w:r>
         <w:rPr>
@@ -4696,7 +5056,7 @@
         <w:rPr>
           <w:noProof/>
         </w:rPr>
-        <w:instrText xml:space="preserve"> PAGEREF _Toc240888961 \h </w:instrText>
+        <w:instrText xml:space="preserve"> PAGEREF _Toc240904568 \h </w:instrText>
       </w:r>
       <w:r>
         <w:rPr>
@@ -4713,7 +5073,7 @@
         <w:rPr>
           <w:noProof/>
         </w:rPr>
-        <w:t>32</w:t>
+        <w:t>35</w:t>
       </w:r>
       <w:r>
         <w:rPr>
@@ -4756,7 +5116,7 @@
         <w:rPr>
           <w:noProof/>
         </w:rPr>
-        <w:instrText xml:space="preserve"> PAGEREF _Toc240888962 \h </w:instrText>
+        <w:instrText xml:space="preserve"> PAGEREF _Toc240904569 \h </w:instrText>
       </w:r>
       <w:r>
         <w:rPr>
@@ -4773,7 +5133,7 @@
         <w:rPr>
           <w:noProof/>
         </w:rPr>
-        <w:t>33</w:t>
+        <w:t>36</w:t>
       </w:r>
       <w:r>
         <w:rPr>
@@ -4816,7 +5176,7 @@
         <w:rPr>
           <w:noProof/>
         </w:rPr>
-        <w:instrText xml:space="preserve"> PAGEREF _Toc240888963 \h </w:instrText>
+        <w:instrText xml:space="preserve"> PAGEREF _Toc240904570 \h </w:instrText>
       </w:r>
       <w:r>
         <w:rPr>
@@ -4833,7 +5193,7 @@
         <w:rPr>
           <w:noProof/>
         </w:rPr>
-        <w:t>34</w:t>
+        <w:t>37</w:t>
       </w:r>
       <w:r>
         <w:rPr>
@@ -4876,7 +5236,7 @@
         <w:rPr>
           <w:noProof/>
         </w:rPr>
-        <w:instrText xml:space="preserve"> PAGEREF _Toc240888964 \h </w:instrText>
+        <w:instrText xml:space="preserve"> PAGEREF _Toc240904571 \h </w:instrText>
       </w:r>
       <w:r>
         <w:rPr>
@@ -4893,7 +5253,7 @@
         <w:rPr>
           <w:noProof/>
         </w:rPr>
-        <w:t>34</w:t>
+        <w:t>37</w:t>
       </w:r>
       <w:r>
         <w:rPr>
@@ -4936,7 +5296,7 @@
         <w:rPr>
           <w:noProof/>
         </w:rPr>
-        <w:instrText xml:space="preserve"> PAGEREF _Toc240888965 \h </w:instrText>
+        <w:instrText xml:space="preserve"> PAGEREF _Toc240904572 \h </w:instrText>
       </w:r>
       <w:r>
         <w:rPr>
@@ -4953,7 +5313,7 @@
         <w:rPr>
           <w:noProof/>
         </w:rPr>
-        <w:t>34</w:t>
+        <w:t>37</w:t>
       </w:r>
       <w:r>
         <w:rPr>
@@ -4996,7 +5356,7 @@
         <w:rPr>
           <w:noProof/>
         </w:rPr>
-        <w:instrText xml:space="preserve"> PAGEREF _Toc240888966 \h </w:instrText>
+        <w:instrText xml:space="preserve"> PAGEREF _Toc240904573 \h </w:instrText>
       </w:r>
       <w:r>
         <w:rPr>
@@ -5013,7 +5373,7 @@
         <w:rPr>
           <w:noProof/>
         </w:rPr>
-        <w:t>34</w:t>
+        <w:t>37</w:t>
       </w:r>
       <w:r>
         <w:rPr>
@@ -5056,7 +5416,7 @@
         <w:rPr>
           <w:noProof/>
         </w:rPr>
-        <w:instrText xml:space="preserve"> PAGEREF _Toc240888967 \h </w:instrText>
+        <w:instrText xml:space="preserve"> PAGEREF _Toc240904574 \h </w:instrText>
       </w:r>
       <w:r>
         <w:rPr>
@@ -5073,7 +5433,7 @@
         <w:rPr>
           <w:noProof/>
         </w:rPr>
-        <w:t>35</w:t>
+        <w:t>38</w:t>
       </w:r>
       <w:r>
         <w:rPr>
@@ -5116,7 +5476,7 @@
         <w:rPr>
           <w:noProof/>
         </w:rPr>
-        <w:instrText xml:space="preserve"> PAGEREF _Toc240888968 \h </w:instrText>
+        <w:instrText xml:space="preserve"> PAGEREF _Toc240904575 \h </w:instrText>
       </w:r>
       <w:r>
         <w:rPr>
@@ -5133,7 +5493,7 @@
         <w:rPr>
           <w:noProof/>
         </w:rPr>
-        <w:t>36</w:t>
+        <w:t>39</w:t>
       </w:r>
       <w:r>
         <w:rPr>
@@ -5176,7 +5536,7 @@
         <w:rPr>
           <w:noProof/>
         </w:rPr>
-        <w:instrText xml:space="preserve"> PAGEREF _Toc240888969 \h </w:instrText>
+        <w:instrText xml:space="preserve"> PAGEREF _Toc240904576 \h </w:instrText>
       </w:r>
       <w:r>
         <w:rPr>
@@ -5193,7 +5553,7 @@
         <w:rPr>
           <w:noProof/>
         </w:rPr>
-        <w:t>36</w:t>
+        <w:t>39</w:t>
       </w:r>
       <w:r>
         <w:rPr>
@@ -5236,7 +5596,7 @@
         <w:rPr>
           <w:noProof/>
         </w:rPr>
-        <w:instrText xml:space="preserve"> PAGEREF _Toc240888970 \h </w:instrText>
+        <w:instrText xml:space="preserve"> PAGEREF _Toc240904577 \h </w:instrText>
       </w:r>
       <w:r>
         <w:rPr>
@@ -5253,7 +5613,7 @@
         <w:rPr>
           <w:noProof/>
         </w:rPr>
-        <w:t>36</w:t>
+        <w:t>39</w:t>
       </w:r>
       <w:r>
         <w:rPr>
@@ -5296,7 +5656,7 @@
         <w:rPr>
           <w:noProof/>
         </w:rPr>
-        <w:instrText xml:space="preserve"> PAGEREF _Toc240888971 \h </w:instrText>
+        <w:instrText xml:space="preserve"> PAGEREF _Toc240904578 \h </w:instrText>
       </w:r>
       <w:r>
         <w:rPr>
@@ -5313,7 +5673,7 @@
         <w:rPr>
           <w:noProof/>
         </w:rPr>
-        <w:t>36</w:t>
+        <w:t>39</w:t>
       </w:r>
       <w:r>
         <w:rPr>
@@ -5356,7 +5716,7 @@
         <w:rPr>
           <w:noProof/>
         </w:rPr>
-        <w:instrText xml:space="preserve"> PAGEREF _Toc240888972 \h </w:instrText>
+        <w:instrText xml:space="preserve"> PAGEREF _Toc240904579 \h </w:instrText>
       </w:r>
       <w:r>
         <w:rPr>
@@ -5373,7 +5733,7 @@
         <w:rPr>
           <w:noProof/>
         </w:rPr>
-        <w:t>36</w:t>
+        <w:t>39</w:t>
       </w:r>
       <w:r>
         <w:rPr>
@@ -5398,7 +5758,7 @@
         <w:rPr>
           <w:noProof/>
         </w:rPr>
-        <w:t>Der Monat in der Zahlungsübersicht stimmt nicht</w:t>
+        <w:t>Nach dem Jahreswechsel fehlen scheinbar Zahlungen im Januar</w:t>
       </w:r>
       <w:r>
         <w:rPr>
@@ -5416,7 +5776,7 @@
         <w:rPr>
           <w:noProof/>
         </w:rPr>
-        <w:instrText xml:space="preserve"> PAGEREF _Toc240888973 \h </w:instrText>
+        <w:instrText xml:space="preserve"> PAGEREF _Toc240904580 \h </w:instrText>
       </w:r>
       <w:r>
         <w:rPr>
@@ -5433,7 +5793,7 @@
         <w:rPr>
           <w:noProof/>
         </w:rPr>
-        <w:t>36</w:t>
+        <w:t>39</w:t>
       </w:r>
       <w:r>
         <w:rPr>
@@ -5458,7 +5818,7 @@
         <w:rPr>
           <w:noProof/>
         </w:rPr>
-        <w:t>Nach dem Jahreswechsel fehlen scheinbar Zahlungen im Januar</w:t>
+        <w:t>Das Programm ist langsam geworden</w:t>
       </w:r>
       <w:r>
         <w:rPr>
@@ -5476,7 +5836,7 @@
         <w:rPr>
           <w:noProof/>
         </w:rPr>
-        <w:instrText xml:space="preserve"> PAGEREF _Toc240888974 \h </w:instrText>
+        <w:instrText xml:space="preserve"> PAGEREF _Toc240904581 \h </w:instrText>
       </w:r>
       <w:r>
         <w:rPr>
@@ -5493,7 +5853,7 @@
         <w:rPr>
           <w:noProof/>
         </w:rPr>
-        <w:t>36</w:t>
+        <w:t>40</w:t>
       </w:r>
       <w:r>
         <w:rPr>
@@ -5518,7 +5878,7 @@
         <w:rPr>
           <w:noProof/>
         </w:rPr>
-        <w:t>Das Programm ist langsam geworden</w:t>
+        <w:t>Eine Zelle lässt sich nicht beschreiben</w:t>
       </w:r>
       <w:r>
         <w:rPr>
@@ -5536,7 +5896,7 @@
         <w:rPr>
           <w:noProof/>
         </w:rPr>
-        <w:instrText xml:space="preserve"> PAGEREF _Toc240888975 \h </w:instrText>
+        <w:instrText xml:space="preserve"> PAGEREF _Toc240904582 \h </w:instrText>
       </w:r>
       <w:r>
         <w:rPr>
@@ -5553,67 +5913,7 @@
         <w:rPr>
           <w:noProof/>
         </w:rPr>
-        <w:t>37</w:t>
-      </w:r>
-      <w:r>
-        <w:rPr>
-          <w:noProof/>
-        </w:rPr>
-        <w:fldChar w:fldCharType="end"/>
-      </w:r>
-    </w:p>
-    <w:p>
-      <w:pPr>
-        <w:pStyle w:val="Verzeichnis2"/>
-        <w:tabs>
-          <w:tab w:val="right" w:leader="dot" w:pos="9401"/>
-        </w:tabs>
-        <w:rPr>
-          <w:rFonts w:eastAsiaTheme="minorEastAsia"/>
-          <w:noProof/>
-          <w:lang w:eastAsia="de-DE"/>
-        </w:rPr>
-      </w:pPr>
-      <w:r>
-        <w:rPr>
-          <w:noProof/>
-        </w:rPr>
-        <w:t>Eine Zelle lässt sich nicht beschreiben</w:t>
-      </w:r>
-      <w:r>
-        <w:rPr>
-          <w:noProof/>
-        </w:rPr>
-        <w:tab/>
-      </w:r>
-      <w:r>
-        <w:rPr>
-          <w:noProof/>
-        </w:rPr>
-        <w:fldChar w:fldCharType="begin"/>
-      </w:r>
-      <w:r>
-        <w:rPr>
-          <w:noProof/>
-        </w:rPr>
-        <w:instrText xml:space="preserve"> PAGEREF _Toc240888976 \h </w:instrText>
-      </w:r>
-      <w:r>
-        <w:rPr>
-          <w:noProof/>
-        </w:rPr>
-      </w:r>
-      <w:r>
-        <w:rPr>
-          <w:noProof/>
-        </w:rPr>
-        <w:fldChar w:fldCharType="separate"/>
-      </w:r>
-      <w:r>
-        <w:rPr>
-          <w:noProof/>
-        </w:rPr>
-        <w:t>37</w:t>
+        <w:t>40</w:t>
       </w:r>
       <w:r>
         <w:rPr>
@@ -5638,6 +5938,7 @@
         <w:rPr>
           <w:noProof/>
         </w:rPr>
+        <w:lastRenderedPageBreak/>
         <w:t>18 Anhang: Kurzübersicht der Eingabefelder</w:t>
       </w:r>
       <w:r>
@@ -5656,7 +5957,7 @@
         <w:rPr>
           <w:noProof/>
         </w:rPr>
-        <w:instrText xml:space="preserve"> PAGEREF _Toc240888977 \h </w:instrText>
+        <w:instrText xml:space="preserve"> PAGEREF _Toc240904583 \h </w:instrText>
       </w:r>
       <w:r>
         <w:rPr>
@@ -5673,7 +5974,7 @@
         <w:rPr>
           <w:noProof/>
         </w:rPr>
-        <w:t>38</w:t>
+        <w:t>41</w:t>
       </w:r>
       <w:r>
         <w:rPr>
@@ -5712,7 +6013,7 @@
       <w:pPr>
         <w:pStyle w:val="berschrift1"/>
       </w:pPr>
-      <w:bookmarkStart w:id="0" w:name="_Toc240888885"/>
+      <w:bookmarkStart w:id="0" w:name="_Toc240904486"/>
       <w:r>
         <w:lastRenderedPageBreak/>
         <w:t>1 Über dieses Handbuch</w:t>
@@ -5723,7 +6024,7 @@
       <w:pPr>
         <w:pStyle w:val="berschrift2"/>
       </w:pPr>
-      <w:bookmarkStart w:id="1" w:name="_Toc240888886"/>
+      <w:bookmarkStart w:id="1" w:name="_Toc240904487"/>
       <w:r>
         <w:t>1.1 An wen es sich richtet</w:t>
       </w:r>
@@ -5738,7 +6039,7 @@
       <w:pPr>
         <w:pStyle w:val="berschrift2"/>
       </w:pPr>
-      <w:bookmarkStart w:id="2" w:name="_Toc240888887"/>
+      <w:bookmarkStart w:id="2" w:name="_Toc240904488"/>
       <w:r>
         <w:t>1.2 Wie Sie damit arbeiten</w:t>
       </w:r>
@@ -5776,7 +6077,7 @@
       <w:pPr>
         <w:pStyle w:val="berschrift2"/>
       </w:pPr>
-      <w:bookmarkStart w:id="3" w:name="_Toc240888888"/>
+      <w:bookmarkStart w:id="3" w:name="_Toc240904489"/>
       <w:r>
         <w:t>1.3 Schreibweisen in diesem Text</w:t>
       </w:r>
@@ -5817,7 +6118,7 @@
       <w:pPr>
         <w:pStyle w:val="berschrift1"/>
       </w:pPr>
-      <w:bookmarkStart w:id="4" w:name="_Toc240888889"/>
+      <w:bookmarkStart w:id="4" w:name="_Toc240904490"/>
       <w:r>
         <w:lastRenderedPageBreak/>
         <w:t>2 Aufbau des Programms</w:t>
@@ -5828,7 +6129,7 @@
       <w:pPr>
         <w:pStyle w:val="berschrift2"/>
       </w:pPr>
-      <w:bookmarkStart w:id="5" w:name="_Toc240888890"/>
+      <w:bookmarkStart w:id="5" w:name="_Toc240904491"/>
       <w:r>
         <w:t>2.1 Die Arbeitsmappe im Überblick</w:t>
       </w:r>
@@ -5995,7 +6296,7 @@
       <w:pPr>
         <w:pStyle w:val="berschrift2"/>
       </w:pPr>
-      <w:bookmarkStart w:id="6" w:name="_Toc240888891"/>
+      <w:bookmarkStart w:id="6" w:name="_Toc240904492"/>
       <w:r>
         <w:t>2.2 Der Weg einer Zahlung durch das Programm</w:t>
       </w:r>
@@ -6116,7 +6417,7 @@
       <w:pPr>
         <w:pStyle w:val="berschrift2"/>
       </w:pPr>
-      <w:bookmarkStart w:id="7" w:name="_Toc240888892"/>
+      <w:bookmarkStart w:id="7" w:name="_Toc240904493"/>
       <w:r>
         <w:t>2.3 Blattschutz</w:t>
       </w:r>
@@ -6142,7 +6443,7 @@
       <w:pPr>
         <w:pStyle w:val="berschrift1"/>
       </w:pPr>
-      <w:bookmarkStart w:id="8" w:name="_Toc240888893"/>
+      <w:bookmarkStart w:id="8" w:name="_Toc240904494"/>
       <w:r>
         <w:lastRenderedPageBreak/>
         <w:t>3 Die Startseite</w:t>
@@ -6158,7 +6459,7 @@
           <w:noProof/>
         </w:rPr>
         <w:drawing>
-          <wp:inline distT="0" distB="0" distL="0" distR="0" wp14:anchorId="4A96E6A8" wp14:editId="5E0A60E6">
+          <wp:inline distT="0" distB="0" distL="0" distR="0" wp14:anchorId="1E770750" wp14:editId="09202B51">
             <wp:extent cx="5975985" cy="3170555"/>
             <wp:effectExtent l="0" t="0" r="5715" b="0"/>
             <wp:docPr id="1" name="Grafik 1"/>
@@ -6224,7 +6525,7 @@
       <w:pPr>
         <w:pStyle w:val="berschrift2"/>
       </w:pPr>
-      <w:bookmarkStart w:id="9" w:name="_Toc240888894"/>
+      <w:bookmarkStart w:id="9" w:name="_Toc240904495"/>
       <w:r>
         <w:t>3.1 Kennzahlen</w:t>
       </w:r>
@@ -6239,7 +6540,7 @@
       <w:pPr>
         <w:pStyle w:val="berschrift2"/>
       </w:pPr>
-      <w:bookmarkStart w:id="10" w:name="_Toc240888895"/>
+      <w:bookmarkStart w:id="10" w:name="_Toc240904496"/>
       <w:r>
         <w:t>3.2 Navigation</w:t>
       </w:r>
@@ -7151,7 +7452,7 @@
       <w:pPr>
         <w:pStyle w:val="berschrift2"/>
       </w:pPr>
-      <w:bookmarkStart w:id="11" w:name="_Toc240888896"/>
+      <w:bookmarkStart w:id="11" w:name="_Toc240904497"/>
       <w:r>
         <w:t>3.3 Zurück zur Startseite</w:t>
       </w:r>
@@ -7171,7 +7472,7 @@
       <w:pPr>
         <w:pStyle w:val="berschrift1"/>
       </w:pPr>
-      <w:bookmarkStart w:id="12" w:name="_Toc240888897"/>
+      <w:bookmarkStart w:id="12" w:name="_Toc240904498"/>
       <w:r>
         <w:lastRenderedPageBreak/>
         <w:t>4 Grundeinrichtung auf dem Blatt Einstellungen</w:t>
@@ -7187,7 +7488,7 @@
           <w:noProof/>
         </w:rPr>
         <w:drawing>
-          <wp:inline distT="0" distB="0" distL="0" distR="0" wp14:anchorId="4DDDDD83" wp14:editId="6E0FC9B0">
+          <wp:inline distT="0" distB="0" distL="0" distR="0" wp14:anchorId="30CAA1CA" wp14:editId="060F25B6">
             <wp:extent cx="5975985" cy="3134995"/>
             <wp:effectExtent l="0" t="0" r="5715" b="8255"/>
             <wp:docPr id="2" name="Grafik 2"/>
@@ -7262,7 +7563,7 @@
       <w:pPr>
         <w:pStyle w:val="berschrift2"/>
       </w:pPr>
-      <w:bookmarkStart w:id="13" w:name="_Toc240888898"/>
+      <w:bookmarkStart w:id="13" w:name="_Toc240904499"/>
       <w:r>
         <w:t>4.1 Vereinsdaten und Jahreswerte</w:t>
       </w:r>
@@ -7840,7 +8141,7 @@
       <w:pPr>
         <w:pStyle w:val="berschrift2"/>
       </w:pPr>
-      <w:bookmarkStart w:id="14" w:name="_Toc240888899"/>
+      <w:bookmarkStart w:id="14" w:name="_Toc240904500"/>
       <w:r>
         <w:t>4.2 Die Tabelle Zahlungstermine</w:t>
       </w:r>
@@ -8483,7 +8784,7 @@
       <w:pPr>
         <w:pStyle w:val="berschrift3"/>
       </w:pPr>
-      <w:bookmarkStart w:id="15" w:name="_Toc240888900"/>
+      <w:bookmarkStart w:id="15" w:name="_Toc240904501"/>
       <w:r>
         <w:t>Soll-Tag und Soll-Monate oder Stichtag fix</w:t>
       </w:r>
@@ -8498,7 +8799,7 @@
       <w:pPr>
         <w:pStyle w:val="berschrift3"/>
       </w:pPr>
-      <w:bookmarkStart w:id="16" w:name="_Toc240888901"/>
+      <w:bookmarkStart w:id="16" w:name="_Toc240904502"/>
       <w:r>
         <w:t>Vorlaufzeit und Nachlaufzeit</w:t>
       </w:r>
@@ -8530,7 +8831,7 @@
       <w:pPr>
         <w:pStyle w:val="berschrift1"/>
       </w:pPr>
-      <w:bookmarkStart w:id="17" w:name="_Toc240888902"/>
+      <w:bookmarkStart w:id="17" w:name="_Toc240904503"/>
       <w:r>
         <w:lastRenderedPageBreak/>
         <w:t>5 Mitglieder verwalten</w:t>
@@ -8546,7 +8847,7 @@
           <w:noProof/>
         </w:rPr>
         <w:drawing>
-          <wp:inline distT="0" distB="0" distL="0" distR="0" wp14:anchorId="58BB1129" wp14:editId="20DD8FFD">
+          <wp:inline distT="0" distB="0" distL="0" distR="0" wp14:anchorId="5BB22011" wp14:editId="5F4A5F8A">
             <wp:extent cx="5975985" cy="3134995"/>
             <wp:effectExtent l="0" t="0" r="5715" b="8255"/>
             <wp:docPr id="3" name="Grafik 3"/>
@@ -8607,7 +8908,7 @@
       <w:pPr>
         <w:pStyle w:val="berschrift2"/>
       </w:pPr>
-      <w:bookmarkStart w:id="18" w:name="_Toc240888903"/>
+      <w:bookmarkStart w:id="18" w:name="_Toc240904504"/>
       <w:r>
         <w:t>5.1 Das Blatt Mitgliederliste</w:t>
       </w:r>
@@ -9566,7 +9867,7 @@
       <w:pPr>
         <w:pStyle w:val="berschrift3"/>
       </w:pPr>
-      <w:bookmarkStart w:id="19" w:name="_Toc240888904"/>
+      <w:bookmarkStart w:id="19" w:name="_Toc240904505"/>
       <w:r>
         <w:lastRenderedPageBreak/>
         <w:t>Spalte O Funktion</w:t>
@@ -9582,7 +9883,7 @@
       <w:pPr>
         <w:pStyle w:val="berschrift3"/>
       </w:pPr>
-      <w:bookmarkStart w:id="20" w:name="_Toc240888905"/>
+      <w:bookmarkStart w:id="20" w:name="_Toc240904506"/>
       <w:r>
         <w:t>Spalte P Mitglieds- oder Pachtbeginn</w:t>
       </w:r>
@@ -9597,7 +9898,7 @@
       <w:pPr>
         <w:pStyle w:val="berschrift3"/>
       </w:pPr>
-      <w:bookmarkStart w:id="21" w:name="_Toc240888906"/>
+      <w:bookmarkStart w:id="21" w:name="_Toc240904507"/>
       <w:r>
         <w:t>Spalte Q Pachtende</w:t>
       </w:r>
@@ -9612,7 +9913,7 @@
       <w:pPr>
         <w:pStyle w:val="berschrift2"/>
       </w:pPr>
-      <w:bookmarkStart w:id="22" w:name="_Toc240888907"/>
+      <w:bookmarkStart w:id="22" w:name="_Toc240904508"/>
       <w:r>
         <w:t>5.2 Die Mitgliederverwaltung</w:t>
       </w:r>
@@ -9627,7 +9928,7 @@
       <w:pPr>
         <w:pStyle w:val="berschrift2"/>
       </w:pPr>
-      <w:bookmarkStart w:id="23" w:name="_Toc240888908"/>
+      <w:bookmarkStart w:id="23" w:name="_Toc240904509"/>
       <w:r>
         <w:t>5.3 Partner auf einer Parzelle</w:t>
       </w:r>
@@ -9657,7 +9958,7 @@
       <w:pPr>
         <w:pStyle w:val="berschrift1"/>
       </w:pPr>
-      <w:bookmarkStart w:id="24" w:name="_Toc240888909"/>
+      <w:bookmarkStart w:id="24" w:name="_Toc240904510"/>
       <w:r>
         <w:lastRenderedPageBreak/>
         <w:t>6 Das Blatt Daten: Kategorien und Zuordnung</w:t>
@@ -9673,7 +9974,7 @@
           <w:noProof/>
         </w:rPr>
         <w:drawing>
-          <wp:inline distT="0" distB="0" distL="0" distR="0" wp14:anchorId="043263E8" wp14:editId="27503344">
+          <wp:inline distT="0" distB="0" distL="0" distR="0" wp14:anchorId="50CE7CC1" wp14:editId="3349459A">
             <wp:extent cx="5975985" cy="3134995"/>
             <wp:effectExtent l="0" t="0" r="5715" b="8255"/>
             <wp:docPr id="4" name="Grafik 4"/>
@@ -9748,7 +10049,7 @@
       <w:pPr>
         <w:pStyle w:val="berschrift2"/>
       </w:pPr>
-      <w:bookmarkStart w:id="25" w:name="_Toc240888910"/>
+      <w:bookmarkStart w:id="25" w:name="_Toc240904511"/>
       <w:r>
         <w:t>6.1 Die Kategorietabelle</w:t>
       </w:r>
@@ -10317,7 +10618,7 @@
       <w:pPr>
         <w:pStyle w:val="berschrift3"/>
       </w:pPr>
-      <w:bookmarkStart w:id="26" w:name="_Toc240888911"/>
+      <w:bookmarkStart w:id="26" w:name="_Toc240904512"/>
       <w:r>
         <w:t>Mehrere Schlüsselwörter für dieselbe Kategorie</w:t>
       </w:r>
@@ -10332,7 +10633,7 @@
       <w:pPr>
         <w:pStyle w:val="berschrift3"/>
       </w:pPr>
-      <w:bookmarkStart w:id="27" w:name="_Toc240888912"/>
+      <w:bookmarkStart w:id="27" w:name="_Toc240904513"/>
       <w:r>
         <w:lastRenderedPageBreak/>
         <w:t>Schlüsselwörter aus mehreren Wörtern</w:t>
@@ -10348,7 +10649,7 @@
       <w:pPr>
         <w:pStyle w:val="berschrift3"/>
       </w:pPr>
-      <w:bookmarkStart w:id="28" w:name="_Toc240888913"/>
+      <w:bookmarkStart w:id="28" w:name="_Toc240904514"/>
       <w:r>
         <w:t>Spalte N Zielspalte</w:t>
       </w:r>
@@ -10397,7 +10698,7 @@
       <w:pPr>
         <w:pStyle w:val="berschrift3"/>
       </w:pPr>
-      <w:bookmarkStart w:id="29" w:name="_Toc240888914"/>
+      <w:bookmarkStart w:id="29" w:name="_Toc240904515"/>
       <w:r>
         <w:t>Spalte O Fälligkeit</w:t>
       </w:r>
@@ -10485,7 +10786,7 @@
       <w:pPr>
         <w:pStyle w:val="berschrift2"/>
       </w:pPr>
-      <w:bookmarkStart w:id="30" w:name="_Toc240888915"/>
+      <w:bookmarkStart w:id="30" w:name="_Toc240904516"/>
       <w:r>
         <w:t>6.2 Die Zuordnungstabelle</w:t>
       </w:r>
@@ -11054,7 +11355,7 @@
       <w:pPr>
         <w:pStyle w:val="berschrift3"/>
       </w:pPr>
-      <w:bookmarkStart w:id="31" w:name="_Toc240888916"/>
+      <w:bookmarkStart w:id="31" w:name="_Toc240904517"/>
       <w:r>
         <w:lastRenderedPageBreak/>
         <w:t>So füllen Sie die Tabelle</w:t>
@@ -11075,7 +11376,7 @@
       <w:pPr>
         <w:pStyle w:val="berschrift3"/>
       </w:pPr>
-      <w:bookmarkStart w:id="32" w:name="_Toc240888917"/>
+      <w:bookmarkStart w:id="32" w:name="_Toc240904518"/>
       <w:r>
         <w:t>Die Zuordnungsrollen</w:t>
       </w:r>
@@ -11509,7 +11810,7 @@
       <w:pPr>
         <w:pStyle w:val="berschrift2"/>
       </w:pPr>
-      <w:bookmarkStart w:id="33" w:name="_Toc240888918"/>
+      <w:bookmarkStart w:id="33" w:name="_Toc240904519"/>
       <w:r>
         <w:t>6.3 Wie die automatische Kategoriefindung arbeitet</w:t>
       </w:r>
@@ -11524,7 +11825,7 @@
       <w:pPr>
         <w:pStyle w:val="berschrift3"/>
       </w:pPr>
-      <w:bookmarkStart w:id="34" w:name="_Toc240888919"/>
+      <w:bookmarkStart w:id="34" w:name="_Toc240904520"/>
       <w:r>
         <w:t>Schritt 1: Text vereinheitlichen</w:t>
       </w:r>
@@ -11539,7 +11840,7 @@
       <w:pPr>
         <w:pStyle w:val="berschrift3"/>
       </w:pPr>
-      <w:bookmarkStart w:id="35" w:name="_Toc240888920"/>
+      <w:bookmarkStart w:id="35" w:name="_Toc240904521"/>
       <w:r>
         <w:t>Schritt 2: Schlüsselwörter suchen</w:t>
       </w:r>
@@ -11554,7 +11855,7 @@
       <w:pPr>
         <w:pStyle w:val="berschrift3"/>
       </w:pPr>
-      <w:bookmarkStart w:id="36" w:name="_Toc240888921"/>
+      <w:bookmarkStart w:id="36" w:name="_Toc240904522"/>
       <w:r>
         <w:lastRenderedPageBreak/>
         <w:t>Schritt 3: Punkte vergeben</w:t>
@@ -11639,7 +11940,7 @@
       <w:pPr>
         <w:pStyle w:val="berschrift3"/>
       </w:pPr>
-      <w:bookmarkStart w:id="37" w:name="_Toc240888922"/>
+      <w:bookmarkStart w:id="37" w:name="_Toc240904523"/>
       <w:r>
         <w:t>Schritt 4: Entscheiden</w:t>
       </w:r>
@@ -11691,7 +11992,7 @@
       <w:pPr>
         <w:pStyle w:val="berschrift3"/>
       </w:pPr>
-      <w:bookmarkStart w:id="38" w:name="_Toc240888923"/>
+      <w:bookmarkStart w:id="38" w:name="_Toc240904524"/>
       <w:r>
         <w:t>Was Sie tun können, damit mehr grün wird</w:t>
       </w:r>
@@ -11716,7 +12017,7 @@
       <w:pPr>
         <w:pStyle w:val="berschrift1"/>
       </w:pPr>
-      <w:bookmarkStart w:id="39" w:name="_Toc240888924"/>
+      <w:bookmarkStart w:id="39" w:name="_Toc240904525"/>
       <w:r>
         <w:lastRenderedPageBreak/>
         <w:t>7 Das Blatt Bankkonto</w:t>
@@ -11732,7 +12033,7 @@
           <w:noProof/>
         </w:rPr>
         <w:drawing>
-          <wp:inline distT="0" distB="0" distL="0" distR="0" wp14:anchorId="496FB078" wp14:editId="4C4FBA2A">
+          <wp:inline distT="0" distB="0" distL="0" distR="0" wp14:anchorId="049F4BF9" wp14:editId="0A2DB843">
             <wp:extent cx="5975985" cy="3134995"/>
             <wp:effectExtent l="0" t="0" r="5715" b="8255"/>
             <wp:docPr id="5" name="Grafik 5"/>
@@ -11807,7 +12108,7 @@
       <w:pPr>
         <w:pStyle w:val="berschrift2"/>
       </w:pPr>
-      <w:bookmarkStart w:id="40" w:name="_Toc240888925"/>
+      <w:bookmarkStart w:id="40" w:name="_Toc240904526"/>
       <w:r>
         <w:t>7.1 Die Spalten</w:t>
       </w:r>
@@ -12831,7 +13132,7 @@
       <w:pPr>
         <w:pStyle w:val="berschrift2"/>
       </w:pPr>
-      <w:bookmarkStart w:id="41" w:name="_Toc240888926"/>
+      <w:bookmarkStart w:id="41" w:name="_Toc240904527"/>
       <w:r>
         <w:t>7.2 Der CSV-Import</w:t>
       </w:r>
@@ -12841,7 +13142,7 @@
       <w:pPr>
         <w:pStyle w:val="berschrift3"/>
       </w:pPr>
-      <w:bookmarkStart w:id="42" w:name="_Toc240888927"/>
+      <w:bookmarkStart w:id="42" w:name="_Toc240904528"/>
       <w:r>
         <w:t>Welche Datei das Programm erwartet</w:t>
       </w:r>
@@ -12866,7 +13167,7 @@
       <w:pPr>
         <w:pStyle w:val="berschrift3"/>
       </w:pPr>
-      <w:bookmarkStart w:id="43" w:name="_Toc240888928"/>
+      <w:bookmarkStart w:id="43" w:name="_Toc240904529"/>
       <w:r>
         <w:t>Der Ablauf</w:t>
       </w:r>
@@ -12970,7 +13271,7 @@
       <w:pPr>
         <w:pStyle w:val="berschrift3"/>
       </w:pPr>
-      <w:bookmarkStart w:id="44" w:name="_Toc240888929"/>
+      <w:bookmarkStart w:id="44" w:name="_Toc240904530"/>
       <w:r>
         <w:t>Die Meldungen am Ende</w:t>
       </w:r>
@@ -13002,7 +13303,7 @@
       <w:pPr>
         <w:pStyle w:val="berschrift3"/>
       </w:pPr>
-      <w:bookmarkStart w:id="45" w:name="_Toc240888930"/>
+      <w:bookmarkStart w:id="45" w:name="_Toc240904531"/>
       <w:r>
         <w:lastRenderedPageBreak/>
         <w:t>Einen Monat übersprungen</w:t>
@@ -13011,6 +13312,28 @@
     </w:p>
     <w:p>
       <w:r>
+        <w:t>Bevor die Daten eingetragen werden, prüft das Programm, ob zwischen dem ersten und dem letzten Monat mit Buchungen ein Monat ganz ohne Buchungen bliebe. Ist das der Fall, meldet es sich:</w:t>
+      </w:r>
+    </w:p>
+    <w:p>
+      <w:pPr>
+        <w:spacing w:before="120" w:after="120"/>
+        <w:ind w:left="340" w:right="340"/>
+      </w:pPr>
+      <w:r>
+        <w:rPr>
+          <w:i/>
+        </w:rPr>
+        <w:t>Zwischen den Kontoauszügen fehlt ein Monat.</w:t>
+      </w:r>
+    </w:p>
+    <w:p>
+      <w:r>
+        <w:t>Der Grund für die Rückfrage: Ohne Buchungen für den fehlenden Monat sieht es in der Zahlungsübersicht so aus, als hätte in diesem Zeitraum niemand gezahlt. Sie haben die Wahl, jetzt trotzdem zu importieren oder abzubrechen und den fehlenden Auszug zuerst zu holen. Bei Abbruch wird nichts eingetragen.</w:t>
+      </w:r>
+    </w:p>
+    <w:p>
+      <w:r>
         <w:t>Wenn Sie einen Monat auslassen und später nachholen, funktioniert die Kategoriefindung für den nachgereichten Monat genauso wie für alle anderen. Manuelle Korrekturen, die Sie in anderen Monaten vorgenommen haben, bleiben dabei unangetastet: Das Programm überschreibt weder grün markierte Kategorien noch von Hand gesetzte Perioden.</w:t>
       </w:r>
     </w:p>
@@ -13018,7 +13341,7 @@
       <w:pPr>
         <w:pStyle w:val="berschrift2"/>
       </w:pPr>
-      <w:bookmarkStart w:id="46" w:name="_Toc240888931"/>
+      <w:bookmarkStart w:id="46" w:name="_Toc240904532"/>
       <w:r>
         <w:t>7.3 Die Ampel in Spalte H</w:t>
       </w:r>
@@ -13332,7 +13655,7 @@
       <w:pPr>
         <w:pStyle w:val="berschrift2"/>
       </w:pPr>
-      <w:bookmarkStart w:id="47" w:name="_Toc240888932"/>
+      <w:bookmarkStart w:id="47" w:name="_Toc240904533"/>
       <w:r>
         <w:t>7.4 Monat und Periode in Spalte I</w:t>
       </w:r>
@@ -13364,22 +13687,55 @@
     </w:p>
     <w:p>
       <w:pPr>
-        <w:pStyle w:val="berschrift2"/>
-      </w:pPr>
-      <w:bookmarkStart w:id="48" w:name="_Toc240888933"/>
-      <w:r>
-        <w:t>7.5 Über-pünktliche Daueraufträge</w:t>
+        <w:pStyle w:val="berschrift3"/>
+      </w:pPr>
+      <w:bookmarkStart w:id="48" w:name="_Toc240904534"/>
+      <w:r>
+        <w:lastRenderedPageBreak/>
+        <w:t>Abschlagszahlungen zu festen Terminen</w:t>
       </w:r>
       <w:bookmarkEnd w:id="48"/>
     </w:p>
     <w:p>
-      <w:r>
-        <w:t>Manche Mitglieder haben bei ihrer Bank einen Dauerauftrag eingerichtet, der am Monatsende für den Folgemonat zahlt. Für eine Kategorie, die ohnehin erst zum Monatsletzten fällig ist, lässt sich am Buchungsdatum allein nicht erkennen, ob die Zahlung für den laufenden oder den nächsten Monat gedacht ist.</w:t>
-      </w:r>
-    </w:p>
-    <w:p>
-      <w:r>
-        <w:t>Solange Vorjahresdaten vorliegen, klärt sich das von selbst. Im ersten Jahr fehlen diese Daten aber. Deshalb fragt das Programm in diesem Fall einmalig nach:</w:t>
+      <w:pPr>
+        <w:rPr>
+          <w:rFonts w:ascii="Aptos" w:hAnsi="Aptos"/>
+        </w:rPr>
+      </w:pPr>
+      <w:r>
+        <w:t xml:space="preserve">Trägt eine Kategorie in Spalte E der Zahlungstermine eine Monatsliste wie </w:t>
+      </w:r>
+      <w:r>
+        <w:rPr>
+          <w:rFonts w:ascii="Consolas" w:hAnsi="Consolas"/>
+        </w:rPr>
+        <w:t>03, 06, 09</w:t>
+      </w:r>
+      <w:r>
+        <w:rPr>
+          <w:rFonts w:ascii="Aptos" w:hAnsi="Aptos"/>
+        </w:rPr>
+        <w:t>, dann sind die Termine verabredet. Geht die Zahlung in einem dieser Monate ein, ist die Periode eindeutig, und das Programm fragt nicht nach. Eine Abschlagszahlung, die am 25. März eingeht, gilt für den März, auch wenn die Kategorie erst zum Monatsletzten fällig ist.</w:t>
+      </w:r>
+    </w:p>
+    <w:p>
+      <w:r>
+        <w:t>Nur Kategorien mit leerer Spalte E gelten in jedem Monat. Bei ihnen bleibt das Monatsende mehrdeutig, und es kann zu der Rückfrage im folgenden Abschnitt kommen.</w:t>
+      </w:r>
+    </w:p>
+    <w:p>
+      <w:pPr>
+        <w:pStyle w:val="berschrift3"/>
+      </w:pPr>
+      <w:bookmarkStart w:id="49" w:name="_Toc240904535"/>
+      <w:r>
+        <w:t>Wenn Sie das Blatt mit offenen Angaben verlassen</w:t>
+      </w:r>
+      <w:bookmarkEnd w:id="49"/>
+    </w:p>
+    <w:p>
+      <w:r>
+        <w:t>Sind noch Kategorien in Spalte H oder Monate in Spalte I offen und Sie wechseln auf ein anderes Blatt, meldet sich das Programm:</w:t>
       </w:r>
     </w:p>
     <w:p>
@@ -13391,60 +13747,32 @@
         <w:rPr>
           <w:i/>
         </w:rPr>
-        <w:t>Zahlung am Monatsende, für welchen Monat gilt sie?</w:t>
-      </w:r>
-    </w:p>
-    <w:p>
-      <w:r>
-        <w:lastRenderedPageBreak/>
-        <w:t>Sie bekommen dabei den Kontoinhaber, die Kategorie, den Betrag und das Eingangsdatum genannt und haben drei Möglichkeiten:</w:t>
-      </w:r>
-    </w:p>
-    <w:p>
-      <w:pPr>
-        <w:pStyle w:val="berschrift4"/>
-      </w:pPr>
-      <w:r>
-        <w:rPr>
-          <w:b/>
-        </w:rPr>
-        <w:t>Ja</w:t>
-      </w:r>
-      <w:r>
-        <w:t>: Das Mitglied zahlt über-pünktlich. Alle Monatsend-Zahlungen dieses Mitglieds in dieser Kategorie werden um einen Monat weitergeschoben.</w:t>
-      </w:r>
-    </w:p>
-    <w:p>
-      <w:pPr>
-        <w:pStyle w:val="berschrift4"/>
-      </w:pPr>
-      <w:r>
-        <w:rPr>
-          <w:b/>
-        </w:rPr>
-        <w:t>Nein</w:t>
-      </w:r>
-      <w:r>
-        <w:t>: Die Zahlung gilt für den laufenden Monat.</w:t>
-      </w:r>
-    </w:p>
-    <w:p>
-      <w:pPr>
-        <w:pStyle w:val="berschrift4"/>
-      </w:pPr>
-      <w:r>
-        <w:rPr>
-          <w:b/>
-        </w:rPr>
-        <w:t>Abbrechen</w:t>
-      </w:r>
-      <w:r>
-        <w:t>: Die übrigen Fälle werden übersprungen und beim nächsten Mal erneut gefragt.</w:t>
-      </w:r>
-    </w:p>
-    <w:p>
-      <w:r>
-        <w:t>Die Frage kommt je Mitglied und Kategorie nur einmal. Danach kennt das Programm das Muster und wendet es von allein an.</w:t>
+        <w:t>Bankkonto noch nicht vollständig</w:t>
+      </w:r>
+    </w:p>
+    <w:p>
+      <w:r>
+        <w:t>Der Wechsel wird nicht verhindert. Der Hinweis nennt die Zeile mit der ersten offenen Stelle und erscheint erst wieder, wenn Sie am Bankkonto etwas geändert haben.</w:t>
+      </w:r>
+    </w:p>
+    <w:p>
+      <w:pPr>
+        <w:pStyle w:val="berschrift2"/>
+      </w:pPr>
+      <w:bookmarkStart w:id="50" w:name="_Toc240904536"/>
+      <w:r>
+        <w:t>7.5 Über-pünktliche Daueraufträge</w:t>
+      </w:r>
+      <w:bookmarkEnd w:id="50"/>
+    </w:p>
+    <w:p>
+      <w:r>
+        <w:t>Manche Mitglieder haben bei ihrer Bank einen Dauerauftrag eingerichtet, der am Monatsende für den Folgemonat zahlt. Für eine Kategorie, die ohnehin erst zum Monatsletzten fällig ist, lässt sich am Buchungsdatum allein nicht erkennen, ob die Zahlung für den laufenden oder den nächsten Monat gedacht ist.</w:t>
+      </w:r>
+    </w:p>
+    <w:p>
+      <w:r>
+        <w:t>Solange Vorjahresdaten vorliegen, klärt sich das von selbst. Im ersten Jahr fehlen diese Daten aber. Deshalb fragt das Programm in diesem Fall einmalig nach:</w:t>
       </w:r>
     </w:p>
     <w:p>
@@ -13456,127 +13784,59 @@
         <w:rPr>
           <w:i/>
         </w:rPr>
-        <w:t>Diese Rückfrage klärt einen Fehler, der sich sonst durch das ganze Jahr zieht. Wird eine Ende Dezember geleistete Januarzahlung fälschlich dem Januar zugeordnet, fehlt scheinbar die Februarzahlung, obwohl sie Ende Januar eingegangen ist. Der Versatz setzt sich Monat für Monat fort. Beantworten Sie die Frage deshalb sorgfältig.</w:t>
-      </w:r>
-    </w:p>
-    <w:p>
-      <w:pPr>
-        <w:pStyle w:val="berschrift2"/>
-      </w:pPr>
-      <w:bookmarkStart w:id="49" w:name="_Toc240888934"/>
-      <w:r>
-        <w:t>7.6 Zahlungen aus dem Vorjahr</w:t>
-      </w:r>
-      <w:bookmarkEnd w:id="49"/>
-    </w:p>
-    <w:p>
-      <w:r>
-        <w:t>Fehlt im Januar eine Zahlung, kann sie innerhalb der Vorlaufzeit bereits im Dezember des Vorjahres geleistet worden sein. Liegen für Oktober bis Dezember keine Daten vor, kann das Programm das nicht nachsehen und fragt Sie.</w:t>
-      </w:r>
-    </w:p>
-    <w:p>
-      <w:r>
-        <w:t>Die Frage nennt das Mitglied, die Kategorie, den Betrag und den Zeitraum. Bestätigen Sie die Zahlung, werden Sie anschließend nach dem genauen Zahlungsdatum und dem Betrag gefragt. Aus diesen Angaben kann sich auch ein Guthaben ergeben, wenn mehr gezahlt wurde als fällig war.</w:t>
-      </w:r>
-    </w:p>
-    <w:p>
-      <w:pPr>
-        <w:pStyle w:val="berschrift2"/>
-      </w:pPr>
-      <w:bookmarkStart w:id="50" w:name="_Toc240888935"/>
-      <w:r>
-        <w:t>7.7 Eine Zahlung einem anderen Mitglied zuordnen</w:t>
-      </w:r>
-      <w:bookmarkEnd w:id="50"/>
-    </w:p>
-    <w:p>
-      <w:r>
-        <w:t>Manchmal zahlt jemand anderes als das Mitglied selbst. Der Nachbar überweist für eine fremde Parzelle mit. Im Todesfall begleicht ein Angehöriger die Endabrechnung von seinem eigenen Konto. In beiden Fällen passt die IBAN nicht zum Mitglied, und das Programm kann die Zahlung nicht von allein zuordnen.</w:t>
-      </w:r>
-    </w:p>
-    <w:p>
-      <w:r>
-        <w:t xml:space="preserve">Dafür gibt es auf dem Blatt </w:t>
-      </w:r>
+        <w:t>Zahlung am Monatsende, für welchen Monat gilt sie?</w:t>
+      </w:r>
+    </w:p>
+    <w:p>
+      <w:r>
+        <w:t>Sie bekommen dabei den Kontoinhaber, die Kategorie, den Betrag und das Eingangsdatum genannt und haben drei Möglichkeiten:</w:t>
+      </w:r>
+    </w:p>
+    <w:p>
+      <w:pPr>
+        <w:pStyle w:val="berschrift4"/>
+      </w:pPr>
       <w:r>
         <w:rPr>
           <w:b/>
         </w:rPr>
-        <w:t>Bankkonto</w:t>
-      </w:r>
-      <w:r>
-        <w:t xml:space="preserve"> rechts im Bedienfeld zwei Schaltflächen.</w:t>
-      </w:r>
-    </w:p>
-    <w:p>
-      <w:pPr>
-        <w:pStyle w:val="berschrift3"/>
-      </w:pPr>
-      <w:bookmarkStart w:id="51" w:name="_Toc240888936"/>
-      <w:r>
-        <w:t>"Zahlung zuordnen"</w:t>
-      </w:r>
-      <w:bookmarkEnd w:id="51"/>
-    </w:p>
-    <w:p>
-      <w:pPr>
-        <w:pStyle w:val="berschrift5"/>
-      </w:pPr>
-      <w:r>
-        <w:t>Markieren Sie eine beliebige Zelle in der Zeile der betreffenden Buchung.</w:t>
-      </w:r>
-    </w:p>
-    <w:p>
-      <w:pPr>
-        <w:pStyle w:val="berschrift5"/>
-      </w:pPr>
-      <w:r>
-        <w:t>Klicken Sie auf "Zahlung zuordnen".</w:t>
-      </w:r>
-    </w:p>
-    <w:p>
-      <w:pPr>
-        <w:pStyle w:val="berschrift5"/>
-      </w:pPr>
-      <w:r>
-        <w:t>Das Programm zeigt Ihnen Datum, Betrag, Zahler und Verwendungszweck zur Kontrolle.</w:t>
-      </w:r>
-    </w:p>
-    <w:p>
-      <w:pPr>
-        <w:pStyle w:val="berschrift5"/>
-      </w:pPr>
-      <w:r>
-        <w:t>Geben Sie einen Teil des Namens des Mitglieds ein, dem die Zahlung gutgeschrieben werden soll. Bei mehreren Übereinstimmungen erhalten Sie eine nummerierte Auswahl.</w:t>
-      </w:r>
-    </w:p>
-    <w:p>
-      <w:pPr>
-        <w:pStyle w:val="berschrift5"/>
-      </w:pPr>
-      <w:r>
-        <w:t>Tragen Sie optional eine Begründung ein, zum Beispiel "Erbfall, Zahlung durch Tochter".</w:t>
-      </w:r>
-    </w:p>
-    <w:p>
-      <w:r>
-        <w:t>Die Zahlung zählt ab sofort für das ausgewählte Mitglied. In der Spalte Bemerkung erscheint ein entsprechender Vermerk, damit die Zuordnung nachvollziehbar bleibt.</w:t>
-      </w:r>
-    </w:p>
-    <w:p>
-      <w:pPr>
-        <w:pStyle w:val="berschrift3"/>
-      </w:pPr>
-      <w:bookmarkStart w:id="52" w:name="_Toc240888937"/>
-      <w:r>
-        <w:lastRenderedPageBreak/>
-        <w:t>"Zuordnungen"</w:t>
-      </w:r>
-      <w:bookmarkEnd w:id="52"/>
-    </w:p>
-    <w:p>
-      <w:r>
-        <w:t>Diese Schaltfläche listet alle bestehenden Sonderzuordnungen auf. Sie können eine davon über ihre Nummer wieder aufheben.</w:t>
+        <w:t>Ja</w:t>
+      </w:r>
+      <w:r>
+        <w:t>: Das Mitglied zahlt über-pünktlich. Alle Monatsend-Zahlungen dieses Mitglieds in dieser Kategorie werden um einen Monat weitergeschoben.</w:t>
+      </w:r>
+    </w:p>
+    <w:p>
+      <w:pPr>
+        <w:pStyle w:val="berschrift4"/>
+      </w:pPr>
+      <w:r>
+        <w:rPr>
+          <w:b/>
+        </w:rPr>
+        <w:t>Nein</w:t>
+      </w:r>
+      <w:r>
+        <w:t>: Die Zahlung gilt für den laufenden Monat.</w:t>
+      </w:r>
+    </w:p>
+    <w:p>
+      <w:pPr>
+        <w:pStyle w:val="berschrift4"/>
+      </w:pPr>
+      <w:r>
+        <w:rPr>
+          <w:b/>
+        </w:rPr>
+        <w:t>Abbrechen</w:t>
+      </w:r>
+      <w:r>
+        <w:t>: Die übrigen Fälle werden übersprungen und beim nächsten Mal erneut gefragt.</w:t>
+      </w:r>
+    </w:p>
+    <w:p>
+      <w:r>
+        <w:t>Die Frage kommt je Mitglied und Kategorie nur einmal. Danach kennt das Programm das Muster und wendet es von allein an.</w:t>
       </w:r>
     </w:p>
     <w:p>
@@ -13588,6 +13848,138 @@
         <w:rPr>
           <w:i/>
         </w:rPr>
+        <w:t>Diese Rückfrage klärt einen Fehler, der sich sonst durch das ganze Jahr zieht. Wird eine Ende Dezember geleistete Januarzahlung fälschlich dem Januar zugeordnet, fehlt scheinbar die Februarzahlung, obwohl sie Ende Januar eingegangen ist. Der Versatz setzt sich Monat für Monat fort. Beantworten Sie die Frage deshalb sorgfältig.</w:t>
+      </w:r>
+    </w:p>
+    <w:p>
+      <w:pPr>
+        <w:pStyle w:val="berschrift2"/>
+      </w:pPr>
+      <w:bookmarkStart w:id="51" w:name="_Toc240904537"/>
+      <w:r>
+        <w:lastRenderedPageBreak/>
+        <w:t>7.6 Zahlungen aus dem Vorjahr</w:t>
+      </w:r>
+      <w:bookmarkEnd w:id="51"/>
+    </w:p>
+    <w:p>
+      <w:r>
+        <w:t>Fehlt im Januar eine Zahlung, kann sie innerhalb der Vorlaufzeit bereits im Dezember des Vorjahres geleistet worden sein. Liegen für Oktober bis Dezember keine Daten vor, kann das Programm das nicht nachsehen und fragt Sie.</w:t>
+      </w:r>
+    </w:p>
+    <w:p>
+      <w:r>
+        <w:t>Die Frage nennt das Mitglied, die Kategorie, den Betrag und den Zeitraum. Bestätigen Sie die Zahlung, werden Sie anschließend nach dem genauen Zahlungsdatum und dem Betrag gefragt. Aus diesen Angaben kann sich auch ein Guthaben ergeben, wenn mehr gezahlt wurde als fällig war.</w:t>
+      </w:r>
+    </w:p>
+    <w:p>
+      <w:pPr>
+        <w:pStyle w:val="berschrift2"/>
+      </w:pPr>
+      <w:bookmarkStart w:id="52" w:name="_Toc240904538"/>
+      <w:r>
+        <w:t>7.7 Eine Zahlung einem anderen Mitglied zuordnen</w:t>
+      </w:r>
+      <w:bookmarkEnd w:id="52"/>
+    </w:p>
+    <w:p>
+      <w:r>
+        <w:t>Manchmal zahlt jemand anderes als das Mitglied selbst. Der Nachbar überweist für eine fremde Parzelle mit. Im Todesfall begleicht ein Angehöriger die Endabrechnung von seinem eigenen Konto. In beiden Fällen passt die IBAN nicht zum Mitglied, und das Programm kann die Zahlung nicht von allein zuordnen.</w:t>
+      </w:r>
+    </w:p>
+    <w:p>
+      <w:r>
+        <w:t xml:space="preserve">Dafür gibt es auf dem Blatt </w:t>
+      </w:r>
+      <w:r>
+        <w:rPr>
+          <w:b/>
+        </w:rPr>
+        <w:t>Bankkonto</w:t>
+      </w:r>
+      <w:r>
+        <w:t xml:space="preserve"> rechts im Bedienfeld zwei Schaltflächen.</w:t>
+      </w:r>
+    </w:p>
+    <w:p>
+      <w:pPr>
+        <w:pStyle w:val="berschrift3"/>
+      </w:pPr>
+      <w:bookmarkStart w:id="53" w:name="_Toc240904539"/>
+      <w:r>
+        <w:t>"Zahlung zuordnen"</w:t>
+      </w:r>
+      <w:bookmarkEnd w:id="53"/>
+    </w:p>
+    <w:p>
+      <w:pPr>
+        <w:pStyle w:val="berschrift5"/>
+      </w:pPr>
+      <w:r>
+        <w:t>Markieren Sie eine beliebige Zelle in der Zeile der betreffenden Buchung.</w:t>
+      </w:r>
+    </w:p>
+    <w:p>
+      <w:pPr>
+        <w:pStyle w:val="berschrift5"/>
+      </w:pPr>
+      <w:r>
+        <w:t>Klicken Sie auf "Zahlung zuordnen".</w:t>
+      </w:r>
+    </w:p>
+    <w:p>
+      <w:pPr>
+        <w:pStyle w:val="berschrift5"/>
+      </w:pPr>
+      <w:r>
+        <w:t>Das Programm zeigt Ihnen Datum, Betrag, Zahler und Verwendungszweck zur Kontrolle.</w:t>
+      </w:r>
+    </w:p>
+    <w:p>
+      <w:pPr>
+        <w:pStyle w:val="berschrift5"/>
+      </w:pPr>
+      <w:r>
+        <w:t>Geben Sie einen Teil des Namens des Mitglieds ein, dem die Zahlung gutgeschrieben werden soll. Bei mehreren Übereinstimmungen erhalten Sie eine nummerierte Auswahl.</w:t>
+      </w:r>
+    </w:p>
+    <w:p>
+      <w:pPr>
+        <w:pStyle w:val="berschrift5"/>
+      </w:pPr>
+      <w:r>
+        <w:t>Tragen Sie optional eine Begründung ein, zum Beispiel "Erbfall, Zahlung durch Tochter".</w:t>
+      </w:r>
+    </w:p>
+    <w:p>
+      <w:r>
+        <w:t>Die Zahlung zählt ab sofort für das ausgewählte Mitglied. In der Spalte Bemerkung erscheint ein entsprechender Vermerk, damit die Zuordnung nachvollziehbar bleibt.</w:t>
+      </w:r>
+    </w:p>
+    <w:p>
+      <w:pPr>
+        <w:pStyle w:val="berschrift3"/>
+      </w:pPr>
+      <w:bookmarkStart w:id="54" w:name="_Toc240904540"/>
+      <w:r>
+        <w:t>"Zuordnungen"</w:t>
+      </w:r>
+      <w:bookmarkEnd w:id="54"/>
+    </w:p>
+    <w:p>
+      <w:r>
+        <w:t>Diese Schaltfläche listet alle bestehenden Sonderzuordnungen auf. Sie können eine davon über ihre Nummer wieder aufheben.</w:t>
+      </w:r>
+    </w:p>
+    <w:p>
+      <w:pPr>
+        <w:spacing w:before="120" w:after="120"/>
+        <w:ind w:left="340" w:right="340"/>
+      </w:pPr>
+      <w:r>
+        <w:rPr>
+          <w:i/>
+        </w:rPr>
         <w:t>Eine Sonderzuordnung überschreibt die IBAN-Erkennung nur für diese eine Buchung. Alle anderen Zahlungen desselben Zahlers bleiben unberührt. Die Zuordnung ist dauerhaft gespeichert und übersteht auch einen erneuten Import.</w:t>
       </w:r>
     </w:p>
@@ -13605,12 +13997,12 @@
       <w:pPr>
         <w:pStyle w:val="berschrift1"/>
       </w:pPr>
-      <w:bookmarkStart w:id="53" w:name="_Toc240888938"/>
+      <w:bookmarkStart w:id="55" w:name="_Toc240904541"/>
       <w:r>
         <w:lastRenderedPageBreak/>
         <w:t>8 Die Zahlungsübersicht</w:t>
       </w:r>
-      <w:bookmarkEnd w:id="53"/>
+      <w:bookmarkEnd w:id="55"/>
     </w:p>
     <w:p>
       <w:pPr>
@@ -13621,7 +14013,7 @@
           <w:noProof/>
         </w:rPr>
         <w:drawing>
-          <wp:inline distT="0" distB="0" distL="0" distR="0" wp14:anchorId="06AAF4CE" wp14:editId="1876FB75">
+          <wp:inline distT="0" distB="0" distL="0" distR="0" wp14:anchorId="12A2423B" wp14:editId="07DAD0B1">
             <wp:extent cx="5975985" cy="3134995"/>
             <wp:effectExtent l="0" t="0" r="5715" b="8255"/>
             <wp:docPr id="6" name="Grafik 6"/>
@@ -13696,11 +14088,11 @@
       <w:pPr>
         <w:pStyle w:val="berschrift2"/>
       </w:pPr>
-      <w:bookmarkStart w:id="54" w:name="_Toc240888939"/>
+      <w:bookmarkStart w:id="56" w:name="_Toc240904542"/>
       <w:r>
         <w:t>8.1 Die Spalten</w:t>
       </w:r>
-      <w:bookmarkEnd w:id="54"/>
+      <w:bookmarkEnd w:id="56"/>
     </w:p>
     <w:tbl>
       <w:tblPr>
@@ -14390,11 +14782,11 @@
       <w:pPr>
         <w:pStyle w:val="berschrift3"/>
       </w:pPr>
-      <w:bookmarkStart w:id="55" w:name="_Toc240888940"/>
+      <w:bookmarkStart w:id="57" w:name="_Toc240904543"/>
       <w:r>
         <w:t>Spalte C Monat</w:t>
       </w:r>
-      <w:bookmarkEnd w:id="55"/>
+      <w:bookmarkEnd w:id="57"/>
     </w:p>
     <w:p>
       <w:r>
@@ -14420,15 +14812,20 @@
       </w:r>
     </w:p>
     <w:p>
+      <w:r>
+        <w:lastRenderedPageBreak/>
+        <w:t>Damit das auch dann gilt, wenn Sie eine Periode ändern, während noch andere Zuordnungen offen sind, merkt sich das Programm bei jedem Aufbau den Stand des Bankkontos. Weicht er ab, sobald Sie die Zahlungsübersicht öffnen, wird sie zuerst neu aufgebaut. Das kann einen Moment dauern und geschieht ohne weitere Meldung.</w:t>
+      </w:r>
+    </w:p>
+    <w:p>
       <w:pPr>
         <w:pStyle w:val="berschrift3"/>
       </w:pPr>
-      <w:bookmarkStart w:id="56" w:name="_Toc240888941"/>
-      <w:r>
-        <w:lastRenderedPageBreak/>
+      <w:bookmarkStart w:id="58" w:name="_Toc240904544"/>
+      <w:r>
         <w:t>Spalte E Soll</w:t>
       </w:r>
-      <w:bookmarkEnd w:id="56"/>
+      <w:bookmarkEnd w:id="58"/>
     </w:p>
     <w:p>
       <w:r>
@@ -14448,11 +14845,11 @@
       <w:pPr>
         <w:pStyle w:val="berschrift3"/>
       </w:pPr>
-      <w:bookmarkStart w:id="57" w:name="_Toc240888942"/>
+      <w:bookmarkStart w:id="59" w:name="_Toc240904545"/>
       <w:r>
         <w:t>Spalte F Ist</w:t>
       </w:r>
-      <w:bookmarkEnd w:id="57"/>
+      <w:bookmarkEnd w:id="59"/>
     </w:p>
     <w:p>
       <w:r>
@@ -14470,13 +14867,133 @@
     </w:p>
     <w:p>
       <w:pPr>
+        <w:pStyle w:val="berschrift3"/>
+      </w:pPr>
+      <w:bookmarkStart w:id="60" w:name="_Toc240904546"/>
+      <w:r>
+        <w:t>Wenn Sie das Blatt mit leeren Feldern verlassen</w:t>
+      </w:r>
+      <w:bookmarkEnd w:id="60"/>
+    </w:p>
+    <w:p>
+      <w:r>
+        <w:t>Fehlen noch Beträge in Spalte E oder Spalte F und Sie wechseln auf ein anderes Blatt, meldet sich das Programm:</w:t>
+      </w:r>
+    </w:p>
+    <w:p>
+      <w:pPr>
+        <w:spacing w:before="120" w:after="120"/>
+        <w:ind w:left="340" w:right="340"/>
+      </w:pPr>
+      <w:r>
+        <w:rPr>
+          <w:i/>
+        </w:rPr>
+        <w:t>Zahlungsübersicht noch nicht vollständig</w:t>
+      </w:r>
+    </w:p>
+    <w:p>
+      <w:r>
+        <w:t>Die Meldung nennt, wie viele Zeilen betroffen sind und wo die erste offene Stelle steht; danach springt der Cursor dorthin. Der Wechsel wird nicht verhindert, und der Hinweis erscheint erst wieder nach einer Änderung an der Übersicht.</w:t>
+      </w:r>
+    </w:p>
+    <w:p>
+      <w:pPr>
         <w:pStyle w:val="berschrift2"/>
       </w:pPr>
-      <w:bookmarkStart w:id="58" w:name="_Toc240888943"/>
-      <w:r>
-        <w:t>8.2 Die Ampel in Spalte G</w:t>
-      </w:r>
-      <w:bookmarkEnd w:id="58"/>
+      <w:bookmarkStart w:id="61" w:name="_Toc240904547"/>
+      <w:r>
+        <w:t>8.2 Die Sortierung</w:t>
+      </w:r>
+      <w:bookmarkEnd w:id="61"/>
+    </w:p>
+    <w:p>
+      <w:r>
+        <w:t xml:space="preserve">Die Übersicht wird nach jedem Aufbau in dieser Reihenfolge sortiert: zuerst nach </w:t>
+      </w:r>
+      <w:r>
+        <w:rPr>
+          <w:b/>
+        </w:rPr>
+        <w:t>Parzelle</w:t>
+      </w:r>
+      <w:r>
+        <w:t xml:space="preserve">, dann nach </w:t>
+      </w:r>
+      <w:r>
+        <w:rPr>
+          <w:b/>
+        </w:rPr>
+        <w:t>Monat</w:t>
+      </w:r>
+      <w:r>
+        <w:t xml:space="preserve">, dann nach </w:t>
+      </w:r>
+      <w:r>
+        <w:rPr>
+          <w:b/>
+        </w:rPr>
+        <w:t>Name</w:t>
+      </w:r>
+      <w:r>
+        <w:t xml:space="preserve">, zuletzt nach </w:t>
+      </w:r>
+      <w:r>
+        <w:rPr>
+          <w:b/>
+        </w:rPr>
+        <w:t>Kategorie</w:t>
+      </w:r>
+      <w:r>
+        <w:t>.</w:t>
+      </w:r>
+    </w:p>
+    <w:p>
+      <w:r>
+        <w:t>Der Monat wird dabei zeitlich sortiert, nicht alphabetisch. Sonst stünde April vor Januar.</w:t>
+      </w:r>
+    </w:p>
+    <w:p>
+      <w:pPr>
+        <w:pStyle w:val="berschrift2"/>
+      </w:pPr>
+      <w:bookmarkStart w:id="62" w:name="_Toc240904548"/>
+      <w:r>
+        <w:t>8.3 Ehrenmitglieder</w:t>
+      </w:r>
+      <w:bookmarkEnd w:id="62"/>
+    </w:p>
+    <w:p>
+      <w:r>
+        <w:t>Ein Ehrenmitglied ist vom Mitgliedsbeitrag befreit. Es verschwindet deshalb aber nicht aus der Übersicht, sondern wird weiterhin geführt: mit Soll und Ist von 0,00, dem Status GRÜN und der Bemerkung</w:t>
+      </w:r>
+    </w:p>
+    <w:p>
+      <w:pPr>
+        <w:spacing w:before="120" w:after="120"/>
+        <w:ind w:left="340" w:right="340"/>
+      </w:pPr>
+      <w:r>
+        <w:rPr>
+          <w:i/>
+        </w:rPr>
+        <w:t>Ehrenmitglied vom Mitgliedsbeitrag befreit</w:t>
+      </w:r>
+    </w:p>
+    <w:p>
+      <w:r>
+        <w:t>So sind alle Mitglieder vollständig aufgelistet, und Sie sehen auf einen Blick, dass hier kein Beitrag fehlt, sondern keiner geschuldet wird.</w:t>
+      </w:r>
+    </w:p>
+    <w:p>
+      <w:pPr>
+        <w:pStyle w:val="berschrift2"/>
+      </w:pPr>
+      <w:bookmarkStart w:id="63" w:name="_Toc240904549"/>
+      <w:r>
+        <w:t>8.4 Die Ampel in Spalte G</w:t>
+      </w:r>
+      <w:bookmarkEnd w:id="63"/>
     </w:p>
     <w:tbl>
       <w:tblPr>
@@ -14621,6 +15138,7 @@
               <w:rPr>
                 <w:sz w:val="20"/>
               </w:rPr>
+              <w:lastRenderedPageBreak/>
               <w:t>GELB</w:t>
             </w:r>
           </w:p>
@@ -14711,11 +15229,11 @@
       <w:pPr>
         <w:pStyle w:val="berschrift2"/>
       </w:pPr>
-      <w:bookmarkStart w:id="59" w:name="_Toc240888944"/>
-      <w:r>
-        <w:t>8.3 Säumnisgebühren</w:t>
-      </w:r>
-      <w:bookmarkEnd w:id="59"/>
+      <w:bookmarkStart w:id="64" w:name="_Toc240904550"/>
+      <w:r>
+        <w:t>8.5 Säumnisgebühren</w:t>
+      </w:r>
+      <w:bookmarkEnd w:id="64"/>
     </w:p>
     <w:p>
       <w:r>
@@ -14735,11 +15253,11 @@
       <w:pPr>
         <w:pStyle w:val="berschrift2"/>
       </w:pPr>
-      <w:bookmarkStart w:id="60" w:name="_Toc240888945"/>
-      <w:r>
-        <w:t>8.4 Guthaben</w:t>
-      </w:r>
-      <w:bookmarkEnd w:id="60"/>
+      <w:bookmarkStart w:id="65" w:name="_Toc240904551"/>
+      <w:r>
+        <w:t>8.6 Guthaben</w:t>
+      </w:r>
+      <w:bookmarkEnd w:id="65"/>
     </w:p>
     <w:p>
       <w:r>
@@ -14748,18 +15266,46 @@
     </w:p>
     <w:p>
       <w:r>
-        <w:t>Ein Guthaben gehört dem Mitglied, nicht der Kategorie. Es kann deshalb zwischen Kategorien verschoben oder aufgeteilt werden. Das Programm verrechnet ein Guthaben von sich aus mit späteren offenen Positionen desselben Mitglieds.</w:t>
+        <w:t>Ein Guthaben gehört dem Mitglied, nicht der Kategorie. Es kann deshalb zwischen Kategorien verschoben oder aufgeteilt werden. Das gilt auch für die Betriebskostenabrechnung, die Pacht und die Endabrechnung.</w:t>
+      </w:r>
+    </w:p>
+    <w:p>
+      <w:r>
+        <w:t xml:space="preserve">Bleibt eine Zahlung offen und ist Guthaben vorhanden, fragt das Programm, ob es verrechnet werden soll. Alle Vorschläge erscheinen dabei in </w:t>
+      </w:r>
+      <w:r>
+        <w:rPr>
+          <w:b/>
+        </w:rPr>
+        <w:t>einem</w:t>
+      </w:r>
+      <w:r>
+        <w:t xml:space="preserve"> Fenster, nicht nacheinander. Ihre Antwort wird gespeichert, auch ein Nein: Dieselbe Position wird kein zweites Mal vorgeschlagen.</w:t>
+      </w:r>
+    </w:p>
+    <w:p>
+      <w:r>
+        <w:t xml:space="preserve">Deckt das Guthaben den offenen Betrag vollständig, entsteht </w:t>
+      </w:r>
+      <w:r>
+        <w:rPr>
+          <w:b/>
+        </w:rPr>
+        <w:t>keine Säumnisgebühr</w:t>
+      </w:r>
+      <w:r>
+        <w:t>. Eine bereits vermerkte Gebühr wird in diesem Fall wieder entfernt. Nur wenn das Guthaben nicht ausreicht, bleibt die Gebühr bestehen.</w:t>
       </w:r>
     </w:p>
     <w:p>
       <w:pPr>
         <w:pStyle w:val="berschrift3"/>
       </w:pPr>
-      <w:bookmarkStart w:id="61" w:name="_Toc240888946"/>
+      <w:bookmarkStart w:id="66" w:name="_Toc240904552"/>
       <w:r>
         <w:t>Abgleich mit der Auszahlung</w:t>
       </w:r>
-      <w:bookmarkEnd w:id="61"/>
+      <w:bookmarkEnd w:id="66"/>
     </w:p>
     <w:p>
       <w:r>
@@ -14768,39 +15314,39 @@
     </w:p>
     <w:p>
       <w:r>
+        <w:t>Weicht beides um mehr als einen Cent voneinander ab, erhalten Sie einen Hinweis und in Spalte H einen Vermerk. Prüfen Sie dann, ob die Auszahlung vollständig war und ob sie der richtigen Kategorie zugeordnet wurde.</w:t>
+      </w:r>
+    </w:p>
+    <w:p>
+      <w:pPr>
+        <w:pStyle w:val="berschrift2"/>
+      </w:pPr>
+      <w:bookmarkStart w:id="67" w:name="_Toc240904553"/>
+      <w:r>
         <w:lastRenderedPageBreak/>
-        <w:t>Weicht beides um mehr als einen Cent voneinander ab, erhalten Sie einen Hinweis und in Spalte H einen Vermerk. Prüfen Sie dann, ob die Auszahlung vollständig war und ob sie der richtigen Kategorie zugeordnet wurde.</w:t>
+        <w:t>8.7 Eine gespeicherte Entscheidung zurücknehmen</w:t>
+      </w:r>
+      <w:bookmarkEnd w:id="67"/>
+    </w:p>
+    <w:p>
+      <w:r>
+        <w:t>Einmal getroffene Entscheidungen, etwa die Bestätigung einer Vorjahreszahlung, werden dauerhaft gespeichert und bei jedem Neuaufbau der Übersicht wieder angewendet. Das ist gewollt, denn sonst müssten Sie dieselbe Frage immer wieder beantworten.</w:t>
+      </w:r>
+    </w:p>
+    <w:p>
+      <w:r>
+        <w:t>Haben Sie sich vertan, lässt sich eine solche Entscheidung zurücknehmen. Markieren Sie die betroffenen Zeilen in der Zahlungsübersicht und rufen Sie die Funktion "Gespeicherte Entscheidung zurücknehmen" auf. Die gespeicherten Angaben werden gelöscht und die Übersicht neu berechnet.</w:t>
       </w:r>
     </w:p>
     <w:p>
       <w:pPr>
         <w:pStyle w:val="berschrift2"/>
       </w:pPr>
-      <w:bookmarkStart w:id="62" w:name="_Toc240888947"/>
-      <w:r>
-        <w:t>8.5 Eine gespeicherte Entscheidung zurücknehmen</w:t>
-      </w:r>
-      <w:bookmarkEnd w:id="62"/>
-    </w:p>
-    <w:p>
-      <w:r>
-        <w:t>Einmal getroffene Entscheidungen, etwa die Bestätigung einer Vorjahreszahlung, werden dauerhaft gespeichert und bei jedem Neuaufbau der Übersicht wieder angewendet. Das ist gewollt, denn sonst müssten Sie dieselbe Frage immer wieder beantworten.</w:t>
-      </w:r>
-    </w:p>
-    <w:p>
-      <w:r>
-        <w:t>Haben Sie sich vertan, lässt sich eine solche Entscheidung zurücknehmen. Markieren Sie die betroffenen Zeilen in der Zahlungsübersicht und rufen Sie die Funktion "Gespeicherte Entscheidung zurücknehmen" auf. Die gespeicherten Angaben werden gelöscht und die Übersicht neu berechnet.</w:t>
-      </w:r>
-    </w:p>
-    <w:p>
-      <w:pPr>
-        <w:pStyle w:val="berschrift2"/>
-      </w:pPr>
-      <w:bookmarkStart w:id="63" w:name="_Toc240888948"/>
-      <w:r>
-        <w:t>8.6 Austritt, Todesfall und Erbfall</w:t>
-      </w:r>
-      <w:bookmarkEnd w:id="63"/>
+      <w:bookmarkStart w:id="68" w:name="_Toc240904554"/>
+      <w:r>
+        <w:t>8.8 Austritt, Todesfall und Erbfall</w:t>
+      </w:r>
+      <w:bookmarkEnd w:id="68"/>
     </w:p>
     <w:p>
       <w:r>
@@ -14811,11 +15357,11 @@
       <w:pPr>
         <w:pStyle w:val="berschrift3"/>
       </w:pPr>
-      <w:bookmarkStart w:id="64" w:name="_Toc240888949"/>
+      <w:bookmarkStart w:id="69" w:name="_Toc240904555"/>
       <w:r>
         <w:t>Im Jahr des Austritts</w:t>
       </w:r>
-      <w:bookmarkEnd w:id="64"/>
+      <w:bookmarkEnd w:id="69"/>
     </w:p>
     <w:p>
       <w:r>
@@ -14858,11 +15404,11 @@
       <w:pPr>
         <w:pStyle w:val="berschrift3"/>
       </w:pPr>
-      <w:bookmarkStart w:id="65" w:name="_Toc240888950"/>
+      <w:bookmarkStart w:id="70" w:name="_Toc240904556"/>
       <w:r>
         <w:t>In den Jahren danach</w:t>
       </w:r>
-      <w:bookmarkEnd w:id="65"/>
+      <w:bookmarkEnd w:id="70"/>
     </w:p>
     <w:p>
       <w:r>
@@ -14883,11 +15429,11 @@
       <w:pPr>
         <w:pStyle w:val="berschrift3"/>
       </w:pPr>
-      <w:bookmarkStart w:id="66" w:name="_Toc240888951"/>
+      <w:bookmarkStart w:id="71" w:name="_Toc240904557"/>
       <w:r>
         <w:t>Der Todesfall</w:t>
       </w:r>
-      <w:bookmarkEnd w:id="66"/>
+      <w:bookmarkEnd w:id="71"/>
     </w:p>
     <w:p>
       <w:r>
@@ -14980,12 +15526,12 @@
       <w:pPr>
         <w:pStyle w:val="berschrift1"/>
       </w:pPr>
-      <w:bookmarkStart w:id="67" w:name="_Toc240888952"/>
+      <w:bookmarkStart w:id="72" w:name="_Toc240904558"/>
       <w:r>
         <w:lastRenderedPageBreak/>
         <w:t>9 Das Dashboard Mitgliederzahlungen</w:t>
       </w:r>
-      <w:bookmarkEnd w:id="67"/>
+      <w:bookmarkEnd w:id="72"/>
     </w:p>
     <w:p>
       <w:pPr>
@@ -14996,7 +15542,7 @@
           <w:noProof/>
         </w:rPr>
         <w:drawing>
-          <wp:inline distT="0" distB="0" distL="0" distR="0" wp14:anchorId="3A311C04" wp14:editId="24BA3F76">
+          <wp:inline distT="0" distB="0" distL="0" distR="0" wp14:anchorId="26BD3E93" wp14:editId="5F43C5E7">
             <wp:extent cx="5975985" cy="3134995"/>
             <wp:effectExtent l="0" t="0" r="5715" b="8255"/>
             <wp:docPr id="7" name="Grafik 7"/>
@@ -15083,6 +15629,44 @@
     </w:p>
     <w:p>
       <w:r>
+        <w:t>Unter der Matrix folgen drei Tabellen:</w:t>
+      </w:r>
+    </w:p>
+    <w:p>
+      <w:r>
+        <w:rPr>
+          <w:b/>
+        </w:rPr>
+        <w:t>Verzugsdetails</w:t>
+      </w:r>
+      <w:r>
+        <w:t xml:space="preserve"> listen jede offene oder verspätete Position mit Mitglied, Parzelle, Monat, Kategorie und Betrag. Die letzte Spalte J trägt die Bemerkung. Lange Bemerkungen werden umbrochen, die Zeile wächst mit, und die farbige Markierung umfasst den gesamten Text.</w:t>
+      </w:r>
+    </w:p>
+    <w:p>
+      <w:r>
+        <w:rPr>
+          <w:b/>
+        </w:rPr>
+        <w:t>Säumnisgebühren</w:t>
+      </w:r>
+      <w:r>
+        <w:t xml:space="preserve"> zeigen, für welche Position eine Gebühr angefallen ist.</w:t>
+      </w:r>
+    </w:p>
+    <w:p>
+      <w:r>
+        <w:rPr>
+          <w:b/>
+        </w:rPr>
+        <w:t>Guthaben</w:t>
+      </w:r>
+      <w:r>
+        <w:t xml:space="preserve"> führt jedes bestehende Guthaben mit Parzelle, Mitglied, Monat, Kategorie, Soll, geleisteter Zahlung, ursprünglich entstandenem Guthaben und aktuellem Restguthaben. Die Tabelle gibt damit jederzeit den Stand aus Bankkonto und Zahlungsübersicht wieder: ob ein Guthaben aufgebraucht ist, ob ein Rest bleibt oder ob trotz verbrauchtem Guthaben noch Schulden offen sind. Unten steht die Summe aller Restguthaben.</w:t>
+      </w:r>
+    </w:p>
+    <w:p>
+      <w:r>
         <w:br w:type="page"/>
       </w:r>
     </w:p>
@@ -15090,12 +15674,12 @@
       <w:pPr>
         <w:pStyle w:val="berschrift1"/>
       </w:pPr>
-      <w:bookmarkStart w:id="68" w:name="_Toc240888953"/>
+      <w:bookmarkStart w:id="73" w:name="_Toc240904559"/>
       <w:r>
         <w:lastRenderedPageBreak/>
         <w:t>10 Die Vereinskasse</w:t>
       </w:r>
-      <w:bookmarkEnd w:id="68"/>
+      <w:bookmarkEnd w:id="73"/>
     </w:p>
     <w:p>
       <w:pPr>
@@ -15106,7 +15690,7 @@
           <w:noProof/>
         </w:rPr>
         <w:drawing>
-          <wp:inline distT="0" distB="0" distL="0" distR="0" wp14:anchorId="2AA0255B" wp14:editId="08FDC582">
+          <wp:inline distT="0" distB="0" distL="0" distR="0" wp14:anchorId="328E3874" wp14:editId="415E5037">
             <wp:extent cx="5975985" cy="3134995"/>
             <wp:effectExtent l="0" t="0" r="5715" b="8255"/>
             <wp:docPr id="8" name="Grafik 8"/>
@@ -15210,8 +15794,8 @@
         <w:tblLook w:val="0000" w:firstRow="0" w:lastRow="0" w:firstColumn="0" w:lastColumn="0" w:noHBand="0" w:noVBand="0"/>
       </w:tblPr>
       <w:tblGrid>
-        <w:gridCol w:w="3134"/>
-        <w:gridCol w:w="6267"/>
+        <w:gridCol w:w="3304"/>
+        <w:gridCol w:w="6097"/>
       </w:tblGrid>
       <w:tr>
         <w:tblPrEx>
@@ -15246,7 +15830,7 @@
         </w:tc>
         <w:tc>
           <w:tcPr>
-            <w:tcW w:w="1680" w:type="dxa"/>
+            <w:tcW w:w="1550" w:type="dxa"/>
             <w:shd w:val="clear" w:color="auto" w:fill="E6E6E6"/>
           </w:tcPr>
           <w:p>
@@ -15294,7 +15878,7 @@
         </w:tc>
         <w:tc>
           <w:tcPr>
-            <w:tcW w:w="1680" w:type="dxa"/>
+            <w:tcW w:w="1550" w:type="dxa"/>
             <w:shd w:val="clear" w:color="auto" w:fill="auto"/>
           </w:tcPr>
           <w:p>
@@ -15340,7 +15924,7 @@
         </w:tc>
         <w:tc>
           <w:tcPr>
-            <w:tcW w:w="1680" w:type="dxa"/>
+            <w:tcW w:w="1550" w:type="dxa"/>
             <w:shd w:val="clear" w:color="auto" w:fill="auto"/>
           </w:tcPr>
           <w:p>
@@ -15386,7 +15970,7 @@
         </w:tc>
         <w:tc>
           <w:tcPr>
-            <w:tcW w:w="1680" w:type="dxa"/>
+            <w:tcW w:w="1550" w:type="dxa"/>
             <w:shd w:val="clear" w:color="auto" w:fill="auto"/>
           </w:tcPr>
           <w:p>
@@ -15432,7 +16016,7 @@
         </w:tc>
         <w:tc>
           <w:tcPr>
-            <w:tcW w:w="1680" w:type="dxa"/>
+            <w:tcW w:w="1550" w:type="dxa"/>
             <w:shd w:val="clear" w:color="auto" w:fill="auto"/>
           </w:tcPr>
           <w:p>
@@ -15478,20 +16062,20 @@
         </w:tc>
         <w:tc>
           <w:tcPr>
-            <w:tcW w:w="1680" w:type="dxa"/>
-            <w:shd w:val="clear" w:color="auto" w:fill="auto"/>
-          </w:tcPr>
-          <w:p>
-            <w:pPr>
-              <w:rPr>
-                <w:sz w:val="20"/>
-              </w:rPr>
-            </w:pPr>
-            <w:r>
-              <w:rPr>
-                <w:sz w:val="20"/>
-              </w:rPr>
-              <w:t>Interne Nummer</w:t>
+            <w:tcW w:w="1550" w:type="dxa"/>
+            <w:shd w:val="clear" w:color="auto" w:fill="auto"/>
+          </w:tcPr>
+          <w:p>
+            <w:pPr>
+              <w:rPr>
+                <w:sz w:val="20"/>
+              </w:rPr>
+            </w:pPr>
+            <w:r>
+              <w:rPr>
+                <w:sz w:val="20"/>
+              </w:rPr>
+              <w:t>Interne Nr. (KA)</w:t>
             </w:r>
           </w:p>
         </w:tc>
@@ -15504,6 +16088,79 @@
       </w:r>
     </w:p>
     <w:p>
+      <w:pPr>
+        <w:pStyle w:val="berschrift2"/>
+      </w:pPr>
+      <w:bookmarkStart w:id="74" w:name="_Toc240904560"/>
+      <w:r>
+        <w:t>10.1 Bargeld vom Konto in die Kasse</w:t>
+      </w:r>
+      <w:bookmarkEnd w:id="74"/>
+    </w:p>
+    <w:p>
+      <w:r>
+        <w:t xml:space="preserve">Heben Sie Geld vom Vereinskonto ab, um die Barkasse aufzufüllen, dann ist das keine Ausgabe des Vereins. Das Geld wechselt nur den Ort. Deshalb bekommt eine solche Buchung </w:t>
+      </w:r>
+      <w:r>
+        <w:rPr>
+          <w:b/>
+        </w:rPr>
+        <w:t>keine BK-Nummer</w:t>
+      </w:r>
+      <w:r>
+        <w:t>.</w:t>
+      </w:r>
+    </w:p>
+    <w:p>
+      <w:r>
+        <w:t xml:space="preserve">Sobald die Buchung auf dem Blatt </w:t>
+      </w:r>
+      <w:r>
+        <w:rPr>
+          <w:b/>
+        </w:rPr>
+        <w:t>Bankkonto</w:t>
+      </w:r>
+      <w:r>
+        <w:t xml:space="preserve"> die Kategorie *Bargeldauszahlung* trägt, legt das Programm von selbst den passenden Eintrag in der Vereinskasse an und vergibt auf </w:t>
+      </w:r>
+      <w:r>
+        <w:lastRenderedPageBreak/>
+        <w:t xml:space="preserve">beiden Blättern </w:t>
+      </w:r>
+      <w:r>
+        <w:rPr>
+          <w:b/>
+        </w:rPr>
+        <w:t>dieselbe KA-Nummer</w:t>
+      </w:r>
+      <w:r>
+        <w:t>. Diese eine Nummer ist der Querverweis: Wer die Abhebung auf dem Bankkonto sieht, findet unter derselben Nummer den Eingang in der Kasse.</w:t>
+      </w:r>
+    </w:p>
+    <w:p>
+      <w:r>
+        <w:t>Die Beschreibung in der Vereinskasse lautet dann zum Beispiel:</w:t>
+      </w:r>
+    </w:p>
+    <w:p>
+      <w:pPr>
+        <w:spacing w:before="120" w:after="120"/>
+        <w:ind w:left="340" w:right="340"/>
+      </w:pPr>
+      <w:r>
+        <w:rPr>
+          <w:i/>
+        </w:rPr>
+        <w:t>Bargeldauszahlung an Vereinskasse vom 22.05.2024</w:t>
+      </w:r>
+    </w:p>
+    <w:p>
+      <w:r>
+        <w:t>Die laufenden BK-Nummern der übrigen Ausgaben bleiben davon unberührt und zählen lückenlos weiter.</w:t>
+      </w:r>
+    </w:p>
+    <w:p>
       <w:r>
         <w:br w:type="page"/>
       </w:r>
@@ -15512,12 +16169,12 @@
       <w:pPr>
         <w:pStyle w:val="berschrift1"/>
       </w:pPr>
-      <w:bookmarkStart w:id="69" w:name="_Toc240888954"/>
+      <w:bookmarkStart w:id="75" w:name="_Toc240904561"/>
       <w:r>
         <w:lastRenderedPageBreak/>
         <w:t>11 Strom und Wasser</w:t>
       </w:r>
-      <w:bookmarkEnd w:id="69"/>
+      <w:bookmarkEnd w:id="75"/>
     </w:p>
     <w:p>
       <w:pPr>
@@ -15528,7 +16185,7 @@
           <w:noProof/>
         </w:rPr>
         <w:drawing>
-          <wp:inline distT="0" distB="0" distL="0" distR="0" wp14:anchorId="2C288219" wp14:editId="14D07162">
+          <wp:inline distT="0" distB="0" distL="0" distR="0" wp14:anchorId="645E2C50" wp14:editId="241612CA">
             <wp:extent cx="5975985" cy="3134995"/>
             <wp:effectExtent l="0" t="0" r="5715" b="8255"/>
             <wp:docPr id="9" name="Grafik 9"/>
@@ -15594,7 +16251,7 @@
           <w:noProof/>
         </w:rPr>
         <w:drawing>
-          <wp:inline distT="0" distB="0" distL="0" distR="0" wp14:anchorId="1BC97FFA" wp14:editId="5C892BD8">
+          <wp:inline distT="0" distB="0" distL="0" distR="0" wp14:anchorId="0BD20BE3" wp14:editId="0319C91E">
             <wp:extent cx="5975985" cy="3134995"/>
             <wp:effectExtent l="0" t="0" r="5715" b="8255"/>
             <wp:docPr id="10" name="Grafik 10"/>
@@ -15678,11 +16335,11 @@
       <w:pPr>
         <w:pStyle w:val="berschrift2"/>
       </w:pPr>
-      <w:bookmarkStart w:id="70" w:name="_Toc240888955"/>
+      <w:bookmarkStart w:id="76" w:name="_Toc240904562"/>
       <w:r>
         <w:t>11.1 Zählerstände eintragen</w:t>
       </w:r>
-      <w:bookmarkEnd w:id="70"/>
+      <w:bookmarkEnd w:id="76"/>
     </w:p>
     <w:tbl>
       <w:tblPr>
@@ -16132,11 +16789,11 @@
       <w:pPr>
         <w:pStyle w:val="berschrift2"/>
       </w:pPr>
-      <w:bookmarkStart w:id="71" w:name="_Toc240888956"/>
+      <w:bookmarkStart w:id="77" w:name="_Toc240904563"/>
       <w:r>
         <w:t>11.2 Zählerwechsel</w:t>
       </w:r>
-      <w:bookmarkEnd w:id="71"/>
+      <w:bookmarkEnd w:id="77"/>
     </w:p>
     <w:p>
       <w:r>
@@ -16183,12 +16840,12 @@
       <w:pPr>
         <w:pStyle w:val="berschrift1"/>
       </w:pPr>
-      <w:bookmarkStart w:id="72" w:name="_Toc240888957"/>
+      <w:bookmarkStart w:id="78" w:name="_Toc240904564"/>
       <w:r>
         <w:lastRenderedPageBreak/>
         <w:t>12 Die Finanz-Übersicht</w:t>
       </w:r>
-      <w:bookmarkEnd w:id="72"/>
+      <w:bookmarkEnd w:id="78"/>
     </w:p>
     <w:p>
       <w:pPr>
@@ -16199,7 +16856,7 @@
           <w:noProof/>
         </w:rPr>
         <w:drawing>
-          <wp:inline distT="0" distB="0" distL="0" distR="0" wp14:anchorId="2CA12946" wp14:editId="364CBF2F">
+          <wp:inline distT="0" distB="0" distL="0" distR="0" wp14:anchorId="5C9310AB" wp14:editId="6652D4A5">
             <wp:extent cx="5975985" cy="3134995"/>
             <wp:effectExtent l="0" t="0" r="5715" b="8255"/>
             <wp:docPr id="11" name="Grafik 11"/>
@@ -16284,12 +16941,12 @@
       <w:pPr>
         <w:pStyle w:val="berschrift1"/>
       </w:pPr>
-      <w:bookmarkStart w:id="73" w:name="_Toc240888958"/>
+      <w:bookmarkStart w:id="79" w:name="_Toc240904565"/>
       <w:r>
         <w:lastRenderedPageBreak/>
         <w:t>13 Der Jahreswechsel</w:t>
       </w:r>
-      <w:bookmarkEnd w:id="73"/>
+      <w:bookmarkEnd w:id="79"/>
     </w:p>
     <w:p>
       <w:r>
@@ -16300,11 +16957,11 @@
       <w:pPr>
         <w:pStyle w:val="berschrift2"/>
       </w:pPr>
-      <w:bookmarkStart w:id="74" w:name="_Toc240888959"/>
+      <w:bookmarkStart w:id="80" w:name="_Toc240904566"/>
       <w:r>
         <w:t>13.1 Vorbereitung</w:t>
       </w:r>
-      <w:bookmarkEnd w:id="74"/>
+      <w:bookmarkEnd w:id="80"/>
     </w:p>
     <w:p>
       <w:r>
@@ -16347,11 +17004,11 @@
       <w:pPr>
         <w:pStyle w:val="berschrift2"/>
       </w:pPr>
-      <w:bookmarkStart w:id="75" w:name="_Toc240888960"/>
+      <w:bookmarkStart w:id="81" w:name="_Toc240904567"/>
       <w:r>
         <w:t>13.2 Der Ablauf</w:t>
       </w:r>
-      <w:bookmarkEnd w:id="75"/>
+      <w:bookmarkEnd w:id="81"/>
     </w:p>
     <w:p>
       <w:r>
@@ -16460,11 +17117,11 @@
       <w:pPr>
         <w:pStyle w:val="berschrift2"/>
       </w:pPr>
-      <w:bookmarkStart w:id="76" w:name="_Toc240888961"/>
+      <w:bookmarkStart w:id="82" w:name="_Toc240904568"/>
       <w:r>
         <w:t>13.3 Was erhalten bleibt</w:t>
       </w:r>
-      <w:bookmarkEnd w:id="76"/>
+      <w:bookmarkEnd w:id="82"/>
     </w:p>
     <w:p>
       <w:r>
@@ -16492,12 +17149,12 @@
       <w:pPr>
         <w:pStyle w:val="berschrift1"/>
       </w:pPr>
-      <w:bookmarkStart w:id="77" w:name="_Toc240888962"/>
+      <w:bookmarkStart w:id="83" w:name="_Toc240904569"/>
       <w:r>
         <w:lastRenderedPageBreak/>
         <w:t>14 Die Mitgliederhistorie</w:t>
       </w:r>
-      <w:bookmarkEnd w:id="77"/>
+      <w:bookmarkEnd w:id="83"/>
     </w:p>
     <w:p>
       <w:pPr>
@@ -16508,7 +17165,7 @@
           <w:noProof/>
         </w:rPr>
         <w:drawing>
-          <wp:inline distT="0" distB="0" distL="0" distR="0" wp14:anchorId="382BB85E" wp14:editId="7B9D9972">
+          <wp:inline distT="0" distB="0" distL="0" distR="0" wp14:anchorId="449D2443" wp14:editId="0E245119">
             <wp:extent cx="5975985" cy="3134995"/>
             <wp:effectExtent l="0" t="0" r="5715" b="8255"/>
             <wp:docPr id="12" name="Grafik 12"/>
@@ -17130,22 +17787,22 @@
       <w:pPr>
         <w:pStyle w:val="berschrift1"/>
       </w:pPr>
-      <w:bookmarkStart w:id="78" w:name="_Toc240888963"/>
+      <w:bookmarkStart w:id="84" w:name="_Toc240904570"/>
       <w:r>
         <w:lastRenderedPageBreak/>
         <w:t>15 Sicherung und Wartung</w:t>
       </w:r>
-      <w:bookmarkEnd w:id="78"/>
+      <w:bookmarkEnd w:id="84"/>
     </w:p>
     <w:p>
       <w:pPr>
         <w:pStyle w:val="berschrift2"/>
       </w:pPr>
-      <w:bookmarkStart w:id="79" w:name="_Toc240888964"/>
+      <w:bookmarkStart w:id="85" w:name="_Toc240904571"/>
       <w:r>
         <w:t>15.1 Sicherungen</w:t>
       </w:r>
-      <w:bookmarkEnd w:id="79"/>
+      <w:bookmarkEnd w:id="85"/>
     </w:p>
     <w:p>
       <w:r>
@@ -17156,11 +17813,11 @@
       <w:pPr>
         <w:pStyle w:val="berschrift2"/>
       </w:pPr>
-      <w:bookmarkStart w:id="80" w:name="_Toc240888965"/>
+      <w:bookmarkStart w:id="86" w:name="_Toc240904572"/>
       <w:r>
         <w:t>15.2 Makros müssen erlaubt sein</w:t>
       </w:r>
-      <w:bookmarkEnd w:id="80"/>
+      <w:bookmarkEnd w:id="86"/>
     </w:p>
     <w:p>
       <w:r>
@@ -17176,11 +17833,11 @@
       <w:pPr>
         <w:pStyle w:val="berschrift2"/>
       </w:pPr>
-      <w:bookmarkStart w:id="81" w:name="_Toc240888966"/>
+      <w:bookmarkStart w:id="87" w:name="_Toc240904573"/>
       <w:r>
         <w:t>15.3 Programmstand und Quellcode</w:t>
       </w:r>
-      <w:bookmarkEnd w:id="81"/>
+      <w:bookmarkEnd w:id="87"/>
     </w:p>
     <w:p>
       <w:pPr>
@@ -17218,12 +17875,12 @@
       <w:pPr>
         <w:pStyle w:val="berschrift1"/>
       </w:pPr>
-      <w:bookmarkStart w:id="82" w:name="_Toc240888967"/>
+      <w:bookmarkStart w:id="88" w:name="_Toc240904574"/>
       <w:r>
         <w:lastRenderedPageBreak/>
         <w:t>16 Die Reihenfolge der Einrichtung</w:t>
       </w:r>
-      <w:bookmarkEnd w:id="82"/>
+      <w:bookmarkEnd w:id="88"/>
     </w:p>
     <w:p>
       <w:r>
@@ -17356,22 +18013,22 @@
       <w:pPr>
         <w:pStyle w:val="berschrift1"/>
       </w:pPr>
-      <w:bookmarkStart w:id="83" w:name="_Toc240888968"/>
+      <w:bookmarkStart w:id="89" w:name="_Toc240904575"/>
       <w:r>
         <w:lastRenderedPageBreak/>
         <w:t>17 Wenn etwas nicht stimmt</w:t>
       </w:r>
-      <w:bookmarkEnd w:id="83"/>
+      <w:bookmarkEnd w:id="89"/>
     </w:p>
     <w:p>
       <w:pPr>
         <w:pStyle w:val="berschrift2"/>
       </w:pPr>
-      <w:bookmarkStart w:id="84" w:name="_Toc240888969"/>
+      <w:bookmarkStart w:id="90" w:name="_Toc240904576"/>
       <w:r>
         <w:t>Eine Zahlung taucht bei keinem Mitglied auf</w:t>
       </w:r>
-      <w:bookmarkEnd w:id="84"/>
+      <w:bookmarkEnd w:id="90"/>
     </w:p>
     <w:p>
       <w:r>
@@ -17396,11 +18053,11 @@
       <w:pPr>
         <w:pStyle w:val="berschrift2"/>
       </w:pPr>
-      <w:bookmarkStart w:id="85" w:name="_Toc240888970"/>
+      <w:bookmarkStart w:id="91" w:name="_Toc240904577"/>
       <w:r>
         <w:t>Die Kategorie wird erkannt, aber der Betrag fehlt in den Spalten M bis Z</w:t>
       </w:r>
-      <w:bookmarkEnd w:id="85"/>
+      <w:bookmarkEnd w:id="91"/>
     </w:p>
     <w:p>
       <w:r>
@@ -17425,11 +18082,11 @@
       <w:pPr>
         <w:pStyle w:val="berschrift2"/>
       </w:pPr>
-      <w:bookmarkStart w:id="86" w:name="_Toc240888971"/>
+      <w:bookmarkStart w:id="92" w:name="_Toc240904578"/>
       <w:r>
         <w:t>Eine Kategorie wird immer wieder falsch erkannt</w:t>
       </w:r>
-      <w:bookmarkEnd w:id="86"/>
+      <w:bookmarkEnd w:id="92"/>
     </w:p>
     <w:p>
       <w:r>
@@ -17445,11 +18102,11 @@
       <w:pPr>
         <w:pStyle w:val="berschrift2"/>
       </w:pPr>
-      <w:bookmarkStart w:id="87" w:name="_Toc240888972"/>
+      <w:bookmarkStart w:id="93" w:name="_Toc240904579"/>
       <w:r>
         <w:t>Ein Mitglied ist grün, obwohl es nicht gezahlt hat</w:t>
       </w:r>
-      <w:bookmarkEnd w:id="87"/>
+      <w:bookmarkEnd w:id="93"/>
     </w:p>
     <w:p>
       <w:r>
@@ -17462,54 +18119,49 @@
       </w:r>
     </w:p>
     <w:p>
+      <w:r>
+        <w:t>Der Monat in der Zahlungsübersicht stimmt nicht</w:t>
+      </w:r>
+    </w:p>
+    <w:p>
+      <w:r>
+        <w:t xml:space="preserve">Ändern Sie ihn nicht dort, sondern in Spalte I des Blattes </w:t>
+      </w:r>
+      <w:r>
+        <w:rPr>
+          <w:b/>
+        </w:rPr>
+        <w:t>Bankkonto</w:t>
+      </w:r>
+      <w:r>
+        <w:t>. Das Bankkonto ist maßgeblich; die Zahlungsübersicht übernimmt den Wert von dort.</w:t>
+      </w:r>
+    </w:p>
+    <w:p>
       <w:pPr>
         <w:pStyle w:val="berschrift2"/>
       </w:pPr>
-      <w:bookmarkStart w:id="88" w:name="_Toc240888973"/>
-      <w:r>
-        <w:t>Der Monat in der Zahlungsübersicht stimmt nicht</w:t>
-      </w:r>
-      <w:bookmarkEnd w:id="88"/>
-    </w:p>
-    <w:p>
-      <w:r>
-        <w:t xml:space="preserve">Ändern Sie ihn nicht dort, sondern in Spalte I des Blattes </w:t>
-      </w:r>
-      <w:r>
-        <w:rPr>
-          <w:b/>
-        </w:rPr>
-        <w:t>Bankkonto</w:t>
-      </w:r>
-      <w:r>
-        <w:t>. Das Bankkonto ist maßgeblich; die Zahlungsübersicht übernimmt den Wert von dort.</w:t>
+      <w:bookmarkStart w:id="94" w:name="_Toc240904580"/>
+      <w:r>
+        <w:t>Nach dem Jahreswechsel fehlen scheinbar Zahlungen im Januar</w:t>
+      </w:r>
+      <w:bookmarkEnd w:id="94"/>
+    </w:p>
+    <w:p>
+      <w:r>
+        <w:t>Das ist der Fall aus Abschnitt 7.5. Prüfen Sie, ob die betreffenden Mitglieder über-pünktlich zahlen, und beantworten Sie die Rückfrage des Programms entsprechend.</w:t>
       </w:r>
     </w:p>
     <w:p>
       <w:pPr>
         <w:pStyle w:val="berschrift2"/>
       </w:pPr>
-      <w:bookmarkStart w:id="89" w:name="_Toc240888974"/>
-      <w:r>
-        <w:t>Nach dem Jahreswechsel fehlen scheinbar Zahlungen im Januar</w:t>
-      </w:r>
-      <w:bookmarkEnd w:id="89"/>
-    </w:p>
-    <w:p>
-      <w:r>
-        <w:t>Das ist der Fall aus Abschnitt 7.5. Prüfen Sie, ob die betreffenden Mitglieder über-pünktlich zahlen, und beantworten Sie die Rückfrage des Programms entsprechend.</w:t>
-      </w:r>
-    </w:p>
-    <w:p>
-      <w:pPr>
-        <w:pStyle w:val="berschrift2"/>
-      </w:pPr>
-      <w:bookmarkStart w:id="90" w:name="_Toc240888975"/>
+      <w:bookmarkStart w:id="95" w:name="_Toc240904581"/>
       <w:r>
         <w:lastRenderedPageBreak/>
         <w:t>Das Programm ist langsam geworden</w:t>
       </w:r>
-      <w:bookmarkEnd w:id="90"/>
+      <w:bookmarkEnd w:id="95"/>
     </w:p>
     <w:p>
       <w:r>
@@ -17520,11 +18172,11 @@
       <w:pPr>
         <w:pStyle w:val="berschrift2"/>
       </w:pPr>
-      <w:bookmarkStart w:id="91" w:name="_Toc240888976"/>
+      <w:bookmarkStart w:id="96" w:name="_Toc240904582"/>
       <w:r>
         <w:t>Eine Zelle lässt sich nicht beschreiben</w:t>
       </w:r>
-      <w:bookmarkEnd w:id="91"/>
+      <w:bookmarkEnd w:id="96"/>
     </w:p>
     <w:p>
       <w:r>
@@ -17540,12 +18192,12 @@
       <w:pPr>
         <w:pStyle w:val="berschrift1"/>
       </w:pPr>
-      <w:bookmarkStart w:id="92" w:name="_Toc240888977"/>
+      <w:bookmarkStart w:id="97" w:name="_Toc240904583"/>
       <w:r>
         <w:lastRenderedPageBreak/>
         <w:t>18 Anhang: Kurzübersicht der Eingabefelder</w:t>
       </w:r>
-      <w:bookmarkEnd w:id="92"/>
+      <w:bookmarkEnd w:id="97"/>
     </w:p>
     <w:p>
       <w:r>
@@ -18512,7 +19164,7 @@
         <w:noProof/>
         <w:sz w:val="16"/>
       </w:rPr>
-      <w:t>36</w:t>
+      <w:t>38</w:t>
     </w:r>
     <w:r>
       <w:rPr>
@@ -19007,7 +19659,7 @@
     <w:link w:val="berschrift1Zchn"/>
     <w:uiPriority w:val="9"/>
     <w:qFormat/>
-    <w:rsid w:val="00067243"/>
+    <w:rsid w:val="00282103"/>
     <w:pPr>
       <w:keepNext/>
       <w:keepLines/>
@@ -19029,7 +19681,7 @@
     <w:uiPriority w:val="9"/>
     <w:unhideWhenUsed/>
     <w:qFormat/>
-    <w:rsid w:val="00067243"/>
+    <w:rsid w:val="00282103"/>
     <w:pPr>
       <w:keepNext/>
       <w:keepLines/>
@@ -19051,7 +19703,7 @@
     <w:uiPriority w:val="9"/>
     <w:unhideWhenUsed/>
     <w:qFormat/>
-    <w:rsid w:val="00067243"/>
+    <w:rsid w:val="00282103"/>
     <w:pPr>
       <w:keepNext/>
       <w:keepLines/>
@@ -19073,7 +19725,7 @@
     <w:uiPriority w:val="9"/>
     <w:unhideWhenUsed/>
     <w:qFormat/>
-    <w:rsid w:val="00067243"/>
+    <w:rsid w:val="00282103"/>
     <w:pPr>
       <w:keepNext/>
       <w:keepLines/>
@@ -19095,7 +19747,7 @@
     <w:uiPriority w:val="9"/>
     <w:unhideWhenUsed/>
     <w:qFormat/>
-    <w:rsid w:val="00067243"/>
+    <w:rsid w:val="00282103"/>
     <w:pPr>
       <w:keepNext/>
       <w:keepLines/>
@@ -19116,7 +19768,7 @@
     <w:semiHidden/>
     <w:unhideWhenUsed/>
     <w:qFormat/>
-    <w:rsid w:val="00067243"/>
+    <w:rsid w:val="00282103"/>
     <w:pPr>
       <w:keepNext/>
       <w:keepLines/>
@@ -19139,7 +19791,7 @@
     <w:semiHidden/>
     <w:unhideWhenUsed/>
     <w:qFormat/>
-    <w:rsid w:val="00067243"/>
+    <w:rsid w:val="00282103"/>
     <w:pPr>
       <w:keepNext/>
       <w:keepLines/>
@@ -19160,7 +19812,7 @@
     <w:semiHidden/>
     <w:unhideWhenUsed/>
     <w:qFormat/>
-    <w:rsid w:val="00067243"/>
+    <w:rsid w:val="00282103"/>
     <w:pPr>
       <w:keepNext/>
       <w:keepLines/>
@@ -19183,7 +19835,7 @@
     <w:semiHidden/>
     <w:unhideWhenUsed/>
     <w:qFormat/>
-    <w:rsid w:val="00067243"/>
+    <w:rsid w:val="00282103"/>
     <w:pPr>
       <w:keepNext/>
       <w:keepLines/>
@@ -19227,7 +19879,7 @@
     <w:basedOn w:val="Absatz-Standardschriftart"/>
     <w:link w:val="berschrift1"/>
     <w:uiPriority w:val="9"/>
-    <w:rsid w:val="00067243"/>
+    <w:rsid w:val="00282103"/>
     <w:rPr>
       <w:rFonts w:asciiTheme="majorHAnsi" w:eastAsiaTheme="majorEastAsia" w:hAnsiTheme="majorHAnsi" w:cstheme="majorBidi"/>
       <w:color w:val="0F4761" w:themeColor="accent1" w:themeShade="BF"/>
@@ -19240,7 +19892,7 @@
     <w:basedOn w:val="Absatz-Standardschriftart"/>
     <w:link w:val="berschrift2"/>
     <w:uiPriority w:val="9"/>
-    <w:rsid w:val="00067243"/>
+    <w:rsid w:val="00282103"/>
     <w:rPr>
       <w:rFonts w:asciiTheme="majorHAnsi" w:eastAsiaTheme="majorEastAsia" w:hAnsiTheme="majorHAnsi" w:cstheme="majorBidi"/>
       <w:color w:val="0F4761" w:themeColor="accent1" w:themeShade="BF"/>
@@ -19253,7 +19905,7 @@
     <w:basedOn w:val="Absatz-Standardschriftart"/>
     <w:link w:val="berschrift3"/>
     <w:uiPriority w:val="9"/>
-    <w:rsid w:val="00067243"/>
+    <w:rsid w:val="00282103"/>
     <w:rPr>
       <w:rFonts w:eastAsiaTheme="majorEastAsia" w:cstheme="majorBidi"/>
       <w:color w:val="0F4761" w:themeColor="accent1" w:themeShade="BF"/>
@@ -19266,7 +19918,7 @@
     <w:basedOn w:val="Absatz-Standardschriftart"/>
     <w:link w:val="berschrift4"/>
     <w:uiPriority w:val="9"/>
-    <w:rsid w:val="00067243"/>
+    <w:rsid w:val="00282103"/>
     <w:rPr>
       <w:rFonts w:eastAsiaTheme="majorEastAsia" w:cstheme="majorBidi"/>
       <w:i/>
@@ -19279,7 +19931,7 @@
     <w:basedOn w:val="Absatz-Standardschriftart"/>
     <w:link w:val="berschrift5"/>
     <w:uiPriority w:val="9"/>
-    <w:rsid w:val="00067243"/>
+    <w:rsid w:val="00282103"/>
     <w:rPr>
       <w:rFonts w:eastAsiaTheme="majorEastAsia" w:cstheme="majorBidi"/>
       <w:color w:val="0F4761" w:themeColor="accent1" w:themeShade="BF"/>
@@ -19291,7 +19943,7 @@
     <w:link w:val="berschrift6"/>
     <w:uiPriority w:val="9"/>
     <w:semiHidden/>
-    <w:rsid w:val="00067243"/>
+    <w:rsid w:val="00282103"/>
     <w:rPr>
       <w:rFonts w:eastAsiaTheme="majorEastAsia" w:cstheme="majorBidi"/>
       <w:i/>
@@ -19305,7 +19957,7 @@
     <w:link w:val="berschrift7"/>
     <w:uiPriority w:val="9"/>
     <w:semiHidden/>
-    <w:rsid w:val="00067243"/>
+    <w:rsid w:val="00282103"/>
     <w:rPr>
       <w:rFonts w:eastAsiaTheme="majorEastAsia" w:cstheme="majorBidi"/>
       <w:color w:val="595959" w:themeColor="text1" w:themeTint="A6"/>
@@ -19317,7 +19969,7 @@
     <w:link w:val="berschrift8"/>
     <w:uiPriority w:val="9"/>
     <w:semiHidden/>
-    <w:rsid w:val="00067243"/>
+    <w:rsid w:val="00282103"/>
     <w:rPr>
       <w:rFonts w:eastAsiaTheme="majorEastAsia" w:cstheme="majorBidi"/>
       <w:i/>
@@ -19331,7 +19983,7 @@
     <w:link w:val="berschrift9"/>
     <w:uiPriority w:val="9"/>
     <w:semiHidden/>
-    <w:rsid w:val="00067243"/>
+    <w:rsid w:val="00282103"/>
     <w:rPr>
       <w:rFonts w:eastAsiaTheme="majorEastAsia" w:cstheme="majorBidi"/>
       <w:color w:val="272727" w:themeColor="text1" w:themeTint="D8"/>
@@ -19344,7 +19996,7 @@
     <w:link w:val="TitelZchn"/>
     <w:uiPriority w:val="10"/>
     <w:qFormat/>
-    <w:rsid w:val="00067243"/>
+    <w:rsid w:val="00282103"/>
     <w:pPr>
       <w:spacing w:after="80" w:line="240" w:lineRule="auto"/>
       <w:contextualSpacing/>
@@ -19362,7 +20014,7 @@
     <w:basedOn w:val="Absatz-Standardschriftart"/>
     <w:link w:val="Titel"/>
     <w:uiPriority w:val="10"/>
-    <w:rsid w:val="00067243"/>
+    <w:rsid w:val="00282103"/>
     <w:rPr>
       <w:rFonts w:asciiTheme="majorHAnsi" w:eastAsiaTheme="majorEastAsia" w:hAnsiTheme="majorHAnsi" w:cstheme="majorBidi"/>
       <w:spacing w:val="-10"/>
@@ -19378,7 +20030,7 @@
     <w:link w:val="UntertitelZchn"/>
     <w:uiPriority w:val="11"/>
     <w:qFormat/>
-    <w:rsid w:val="00067243"/>
+    <w:rsid w:val="00282103"/>
     <w:pPr>
       <w:numPr>
         <w:ilvl w:val="1"/>
@@ -19397,7 +20049,7 @@
     <w:basedOn w:val="Absatz-Standardschriftart"/>
     <w:link w:val="Untertitel"/>
     <w:uiPriority w:val="11"/>
-    <w:rsid w:val="00067243"/>
+    <w:rsid w:val="00282103"/>
     <w:rPr>
       <w:rFonts w:eastAsiaTheme="majorEastAsia" w:cstheme="majorBidi"/>
       <w:color w:val="595959" w:themeColor="text1" w:themeTint="A6"/>
@@ -19413,7 +20065,7 @@
     <w:link w:val="ZitatZchn"/>
     <w:uiPriority w:val="29"/>
     <w:qFormat/>
-    <w:rsid w:val="00067243"/>
+    <w:rsid w:val="00282103"/>
     <w:pPr>
       <w:spacing w:before="160"/>
       <w:jc w:val="center"/>
@@ -19429,7 +20081,7 @@
     <w:basedOn w:val="Absatz-Standardschriftart"/>
     <w:link w:val="Zitat"/>
     <w:uiPriority w:val="29"/>
-    <w:rsid w:val="00067243"/>
+    <w:rsid w:val="00282103"/>
     <w:rPr>
       <w:i/>
       <w:iCs/>
@@ -19441,7 +20093,7 @@
     <w:basedOn w:val="Standard"/>
     <w:uiPriority w:val="34"/>
     <w:qFormat/>
-    <w:rsid w:val="00067243"/>
+    <w:rsid w:val="00282103"/>
     <w:pPr>
       <w:ind w:left="720"/>
       <w:contextualSpacing/>
@@ -19452,7 +20104,7 @@
     <w:basedOn w:val="Absatz-Standardschriftart"/>
     <w:uiPriority w:val="21"/>
     <w:qFormat/>
-    <w:rsid w:val="00067243"/>
+    <w:rsid w:val="00282103"/>
     <w:rPr>
       <w:i/>
       <w:iCs/>
@@ -19466,7 +20118,7 @@
     <w:link w:val="IntensivesZitatZchn"/>
     <w:uiPriority w:val="30"/>
     <w:qFormat/>
-    <w:rsid w:val="00067243"/>
+    <w:rsid w:val="00282103"/>
     <w:pPr>
       <w:pBdr>
         <w:top w:val="single" w:sz="4" w:space="10" w:color="0F4761" w:themeColor="accent1" w:themeShade="BF"/>
@@ -19487,7 +20139,7 @@
     <w:basedOn w:val="Absatz-Standardschriftart"/>
     <w:link w:val="IntensivesZitat"/>
     <w:uiPriority w:val="30"/>
-    <w:rsid w:val="00067243"/>
+    <w:rsid w:val="00282103"/>
     <w:rPr>
       <w:i/>
       <w:iCs/>
@@ -19499,7 +20151,7 @@
     <w:basedOn w:val="Absatz-Standardschriftart"/>
     <w:uiPriority w:val="32"/>
     <w:qFormat/>
-    <w:rsid w:val="00067243"/>
+    <w:rsid w:val="00282103"/>
     <w:rPr>
       <w:b/>
       <w:bCs/>
@@ -19514,7 +20166,7 @@
     <w:link w:val="KopfzeileZchn"/>
     <w:uiPriority w:val="99"/>
     <w:unhideWhenUsed/>
-    <w:rsid w:val="00067243"/>
+    <w:rsid w:val="00282103"/>
     <w:pPr>
       <w:tabs>
         <w:tab w:val="center" w:pos="4536"/>
@@ -19528,7 +20180,7 @@
     <w:basedOn w:val="Absatz-Standardschriftart"/>
     <w:link w:val="Kopfzeile"/>
     <w:uiPriority w:val="99"/>
-    <w:rsid w:val="00067243"/>
+    <w:rsid w:val="00282103"/>
   </w:style>
   <w:style w:type="paragraph" w:styleId="Fuzeile">
     <w:name w:val="footer"/>
@@ -19536,7 +20188,7 @@
     <w:link w:val="FuzeileZchn"/>
     <w:uiPriority w:val="99"/>
     <w:unhideWhenUsed/>
-    <w:rsid w:val="00067243"/>
+    <w:rsid w:val="00282103"/>
     <w:pPr>
       <w:tabs>
         <w:tab w:val="center" w:pos="4536"/>
@@ -19550,7 +20202,7 @@
     <w:basedOn w:val="Absatz-Standardschriftart"/>
     <w:link w:val="Fuzeile"/>
     <w:uiPriority w:val="99"/>
-    <w:rsid w:val="00067243"/>
+    <w:rsid w:val="00282103"/>
   </w:style>
   <w:style w:type="paragraph" w:styleId="Verzeichnis1">
     <w:name w:val="toc 1"/>
@@ -19559,7 +20211,7 @@
     <w:autoRedefine/>
     <w:uiPriority w:val="39"/>
     <w:unhideWhenUsed/>
-    <w:rsid w:val="00067243"/>
+    <w:rsid w:val="00282103"/>
     <w:pPr>
       <w:spacing w:after="100"/>
     </w:pPr>
@@ -19571,7 +20223,7 @@
     <w:autoRedefine/>
     <w:uiPriority w:val="39"/>
     <w:unhideWhenUsed/>
-    <w:rsid w:val="00067243"/>
+    <w:rsid w:val="00282103"/>
     <w:pPr>
       <w:spacing w:after="100"/>
       <w:ind w:left="240"/>
@@ -19584,7 +20236,7 @@
     <w:autoRedefine/>
     <w:uiPriority w:val="39"/>
     <w:unhideWhenUsed/>
-    <w:rsid w:val="00067243"/>
+    <w:rsid w:val="00282103"/>
     <w:pPr>
       <w:spacing w:after="100"/>
       <w:ind w:left="480"/>

</xml_diff>